<commit_message>
chỉnh sửa lần 2
</commit_message>
<xml_diff>
--- a/books/09_real_dialogues/output/Hizashi_real_dialogues_v0.2.docx
+++ b/books/09_real_dialogues/output/Hizashi_real_dialogues_v0.2.docx
@@ -1410,14 +1410,7 @@
           <w:b/>
           <w:bCs/>
         </w:rPr>
-        <w:t xml:space="preserve">💡 Bí quyết —</w:t>
-      </w:r>
-      <w:r>
-        <w:rPr>
-          <w:b/>
-          <w:bCs/>
-        </w:rPr>
-        <w:t xml:space="preserve"> </w:t>
+        <w:t xml:space="preserve">💡 Bí quyết — 〈topic〉</w:t>
       </w:r>
       <w:r>
         <w:t xml:space="preserve"> </w:t>
@@ -1822,13 +1815,13 @@
       </w:r>
     </w:p>
     <w:bookmarkEnd w:id="16"/>
-    <w:bookmarkStart w:id="18" w:name="X70acf5feccdb44f007a5b3a66925c456fd555d4"/>
+    <w:bookmarkStart w:id="18" w:name="X80b62f4bf99f2f074ed326d55f34acc0d349b09"/>
     <w:p>
       <w:pPr>
         <w:pStyle w:val="Heading2"/>
       </w:pPr>
       <w:r>
-        <w:t xml:space="preserve">Scene 1 — 08:30 · Cổng đông Tokyo Big Sight (ga Kokusai-Tenjijō, Yurikamome line)</w:t>
+        <w:t xml:space="preserve">Tình huống 1 — 08:30 · Cổng đông Tokyo Big Sight (ga Kokusai-Tenjijō, Yurikamome line)</w:t>
       </w:r>
     </w:p>
     <w:p>
@@ -2418,13 +2411,13 @@
         <w:t xml:space="preserve"> </w:t>
       </w:r>
       <w:r>
-        <w:t xml:space="preserve">‘business mode sáng sớm’</w:t>
-      </w:r>
-      <w:r>
-        <w:t xml:space="preserve"> </w:t>
-      </w:r>
-      <w:r>
-        <w:t xml:space="preserve">— chưa relax. Chào ngắn gọn,</w:t>
+        <w:t xml:space="preserve">‘chế độ công việc buổi sáng’</w:t>
+      </w:r>
+      <w:r>
+        <w:t xml:space="preserve"> </w:t>
+      </w:r>
+      <w:r>
+        <w:t xml:space="preserve">— chưa thư giãn. Chào ngắn gọn,</w:t>
       </w:r>
       <w:r>
         <w:t xml:space="preserve"> </w:t>
@@ -2495,13 +2488,13 @@
     </w:p>
     <w:bookmarkEnd w:id="17"/>
     <w:bookmarkEnd w:id="18"/>
-    <w:bookmarkStart w:id="20" w:name="X31378450ffce7b5f7449fd21b303d9ae388cf64"/>
+    <w:bookmarkStart w:id="20" w:name="X6ada1e4671020d79f59ed202964118212b3d409"/>
     <w:p>
       <w:pPr>
         <w:pStyle w:val="Heading2"/>
       </w:pPr>
       <w:r>
-        <w:t xml:space="preserve">Scene 2 — 09:00 · Khu Registration + Badge (Sảnh entrance Hall West)</w:t>
+        <w:t xml:space="preserve">Tình huống 2 — 09:00 · Khu Registration + Badge (Sảnh entrance Hall West)</w:t>
       </w:r>
     </w:p>
     <w:p>
@@ -3432,13 +3425,13 @@
     </w:p>
     <w:bookmarkEnd w:id="19"/>
     <w:bookmarkEnd w:id="20"/>
-    <w:bookmarkStart w:id="22" w:name="X0f59415bad33b7a9dbd926145968826d9958689"/>
+    <w:bookmarkStart w:id="22" w:name="Xbf91a64337429393e826d8f970c099ae5eba5ac"/>
     <w:p>
       <w:pPr>
         <w:pStyle w:val="Heading2"/>
       </w:pPr>
       <w:r>
-        <w:t xml:space="preserve">Scene 3 — 09:30 · Booth AWS Japan (Hall East 1, gian lớn 200m²)</w:t>
+        <w:t xml:space="preserve">Tình huống 3 — 09:30 · Booth AWS Japan (Hall East 1, gian lớn 200m²)</w:t>
       </w:r>
     </w:p>
     <w:p>
@@ -4565,13 +4558,13 @@
     </w:p>
     <w:bookmarkEnd w:id="21"/>
     <w:bookmarkEnd w:id="22"/>
-    <w:bookmarkStart w:id="24" w:name="Xc16405e581605556537edb7653d616cd23d42c9"/>
+    <w:bookmarkStart w:id="24" w:name="X11c91155c772fa02ef14586363eb1cac47a4554"/>
     <w:p>
       <w:pPr>
         <w:pStyle w:val="Heading2"/>
       </w:pPr>
       <w:r>
-        <w:t xml:space="preserve">Scene 4 — 10:30 · Booth Thanh Hà Software (Hall East 3, ≈50m²)</w:t>
+        <w:t xml:space="preserve">Tình huống 4 — 10:30 · Booth Thanh Hà Software (Hall East 3, ≈50m²)</w:t>
       </w:r>
     </w:p>
     <w:p>
@@ -5415,13 +5408,13 @@
     </w:p>
     <w:bookmarkEnd w:id="23"/>
     <w:bookmarkEnd w:id="24"/>
-    <w:bookmarkStart w:id="26" w:name="X1b9b6f69b9e54627c6c95e9d676a1064c191f50"/>
+    <w:bookmarkStart w:id="26" w:name="X05bc44bd0cb4145d0e7038a83937525b54e19dc"/>
     <w:p>
       <w:pPr>
         <w:pStyle w:val="Heading2"/>
       </w:pPr>
       <w:r>
-        <w:t xml:space="preserve">Scene 5 — 11:30 · Game booth của 1 cty SaaS VN-JP joint venture (Hall West 2, ≈30m²)</w:t>
+        <w:t xml:space="preserve">Tình huống 5 — 11:30 · Game booth của 1 cty SaaS VN-JP joint venture (Hall West 2, ≈30m²)</w:t>
       </w:r>
     </w:p>
     <w:p>
@@ -6157,7 +6150,7 @@
         <w:t xml:space="preserve">‘mình nhớ’</w:t>
       </w:r>
       <w:r>
-        <w:t xml:space="preserve">. Trí nhớ chi tiết về gia đình khách = vũ khí mạnh nhất trong relationship-building.</w:t>
+        <w:t xml:space="preserve">. Trí nhớ chi tiết về gia đình khách = vũ khí mạnh nhất trong xây dựng quan hệ.</w:t>
       </w:r>
     </w:p>
     <w:p>
@@ -6236,13 +6229,13 @@
     </w:p>
     <w:bookmarkEnd w:id="25"/>
     <w:bookmarkEnd w:id="26"/>
-    <w:bookmarkStart w:id="28" w:name="scene-6-1230-food-court-trong-hall-south"/>
+    <w:bookmarkStart w:id="28" w:name="Xfa3d81780879c3373921221588ccb3fb7e81729"/>
     <w:p>
       <w:pPr>
         <w:pStyle w:val="Heading2"/>
       </w:pPr>
       <w:r>
-        <w:t xml:space="preserve">Scene 6 — 12:30 · Food court trong Hall South</w:t>
+        <w:t xml:space="preserve">Tình huống 6 — 12:30 · Food court trong Hall South</w:t>
       </w:r>
     </w:p>
     <w:p>
@@ -7913,13 +7906,13 @@
     </w:p>
     <w:bookmarkEnd w:id="27"/>
     <w:bookmarkEnd w:id="28"/>
-    <w:bookmarkStart w:id="30" w:name="X7b749c59be82673367cef1215ecddbf5942074c"/>
+    <w:bookmarkStart w:id="30" w:name="Xf1ca43b735978ac5b89028ff58776298bd7f06c"/>
     <w:p>
       <w:pPr>
         <w:pStyle w:val="Heading2"/>
       </w:pPr>
       <w:r>
-        <w:t xml:space="preserve">Scene 7 — 14:00 · Keynote Hall — Andrew Ng (qua video link từ Stanford)</w:t>
+        <w:t xml:space="preserve">Tình huống 7 — 14:00 · Keynote Hall — Andrew Ng (qua video link từ Stanford)</w:t>
       </w:r>
     </w:p>
     <w:p>
@@ -8722,13 +8715,13 @@
     </w:p>
     <w:bookmarkEnd w:id="29"/>
     <w:bookmarkEnd w:id="30"/>
-    <w:bookmarkStart w:id="32" w:name="Xe1a6eeceb779f44c6a456f19445bedd04af5890"/>
+    <w:bookmarkStart w:id="32" w:name="X60011925c6b7569ad4a7d709ce4d621d9f6e783"/>
     <w:p>
       <w:pPr>
         <w:pStyle w:val="Heading2"/>
       </w:pPr>
       <w:r>
-        <w:t xml:space="preserve">Scene 8 — 15:30 · Booth của </w:t>
+        <w:t xml:space="preserve">Tình huống 8 — 15:30 · Booth của </w:t>
       </w:r>
       <w:r>
         <w:rPr>
@@ -9910,13 +9903,13 @@
     </w:p>
     <w:bookmarkEnd w:id="31"/>
     <w:bookmarkEnd w:id="32"/>
-    <w:bookmarkStart w:id="34" w:name="Xd22f2ebe6342fc1f20162ab4405f7565855c313"/>
+    <w:bookmarkStart w:id="34" w:name="Xd603c81f655c91758f1aafedb2355b23c049ec3"/>
     <w:p>
       <w:pPr>
         <w:pStyle w:val="Heading2"/>
       </w:pPr>
       <w:r>
-        <w:t xml:space="preserve">Scene 9 — 17:00 · Souvenir corner Tokyo Big Sight + Convenience store</w:t>
+        <w:t xml:space="preserve">Tình huống 9 — 17:00 · Souvenir corner Tokyo Big Sight + Convenience store</w:t>
       </w:r>
     </w:p>
     <w:p>
@@ -10479,7 +10472,7 @@
                 <w:i/>
                 <w:iCs/>
               </w:rPr>
-              <w:t xml:space="preserve">(thì thầm tiếng Nhật cho chắc) Dũng à, tặng cả 3 là overdo. Đơn giản, đưa Matsumoto 1 cái nhỏ là đủ.</w:t>
+              <w:t xml:space="preserve">(thì thầm tiếng Nhật cho chắc) Dũng à, tặng cả 3 là quá đà. Đơn giản, đưa Matsumoto 1 cái nhỏ là đủ.</w:t>
             </w:r>
           </w:p>
         </w:tc>
@@ -10968,7 +10961,7 @@
         <w:t xml:space="preserve"> </w:t>
       </w:r>
       <w:r>
-        <w:t xml:space="preserve">= overdo, phá tinh tế. Chỉ 1 senior cao nhất (hoặc người host chính). Tuấn đã ra hiệu cứu Dũng kịp.</w:t>
+        <w:t xml:space="preserve">= quá đà, phá tinh tế. Chỉ 1 senior cao nhất (hoặc người host chính). Tuấn đã ra hiệu cứu Dũng kịp.</w:t>
       </w:r>
     </w:p>
     <w:p>
@@ -11041,13 +11034,13 @@
     </w:p>
     <w:bookmarkEnd w:id="33"/>
     <w:bookmarkEnd w:id="34"/>
-    <w:bookmarkStart w:id="36" w:name="scene-10-1800-ga-shinbashi-chia-tay"/>
+    <w:bookmarkStart w:id="36" w:name="tình-huống-10-1800-ga-shinbashi-chia-tay"/>
     <w:p>
       <w:pPr>
         <w:pStyle w:val="Heading2"/>
       </w:pPr>
       <w:r>
-        <w:t xml:space="preserve">Scene 10 — 18:00 · Ga Shinbashi — chia tay</w:t>
+        <w:t xml:space="preserve">Tình huống 10 — 18:00 · Ga Shinbashi — chia tay</w:t>
       </w:r>
     </w:p>
     <w:p>
@@ -12663,13 +12656,13 @@
       </w:r>
     </w:p>
     <w:bookmarkEnd w:id="39"/>
-    <w:bookmarkStart w:id="41" w:name="X5e775f6ad99d90342dd8710b43ef84f06c8748f"/>
+    <w:bookmarkStart w:id="41" w:name="X94fe9942b619fdca2538f4d52d647c601d61430"/>
     <w:p>
       <w:pPr>
         <w:pStyle w:val="Heading2"/>
       </w:pPr>
       <w:r>
-        <w:t xml:space="preserve">Scene 1 — Sat 05:30 · Trước khách sạn Shinjuku</w:t>
+        <w:t xml:space="preserve">Tình huống 1 — Sat 05:30 · Trước khách sạn Shinjuku</w:t>
       </w:r>
     </w:p>
     <w:p>
@@ -13038,13 +13031,13 @@
     </w:p>
     <w:bookmarkEnd w:id="40"/>
     <w:bookmarkEnd w:id="41"/>
-    <w:bookmarkStart w:id="43" w:name="scene-2-sat-0700-club-house-locker-room"/>
+    <w:bookmarkStart w:id="43" w:name="X2c4bc07f2f78e0fe5685060b7c0777e8fbf63e4"/>
     <w:p>
       <w:pPr>
         <w:pStyle w:val="Heading2"/>
       </w:pPr>
       <w:r>
-        <w:t xml:space="preserve">Scene 2 — Sat 07:00 · Club house, locker room</w:t>
+        <w:t xml:space="preserve">Tình huống 2 — Sat 07:00 · Club house, locker room</w:t>
       </w:r>
     </w:p>
     <w:p>
@@ -13629,13 +13622,13 @@
     </w:p>
     <w:bookmarkEnd w:id="42"/>
     <w:bookmarkEnd w:id="43"/>
-    <w:bookmarkStart w:id="45" w:name="scene-3-sat-0730-driving-range-warmup"/>
+    <w:bookmarkStart w:id="45" w:name="X16f67aff4d35a24b9805f9fae50c4e6bb70b42a"/>
     <w:p>
       <w:pPr>
         <w:pStyle w:val="Heading2"/>
       </w:pPr>
       <w:r>
-        <w:t xml:space="preserve">Scene 3 — Sat 07:30 · Driving range warmup</w:t>
+        <w:t xml:space="preserve">Tình huống 3 — Sat 07:30 · Driving range warmup</w:t>
       </w:r>
     </w:p>
     <w:p>
@@ -14053,13 +14046,13 @@
     </w:p>
     <w:bookmarkEnd w:id="44"/>
     <w:bookmarkEnd w:id="45"/>
-    <w:bookmarkStart w:id="47" w:name="X42f614f66838e221a571bcb4ed3fd7cdc42e1e4"/>
+    <w:bookmarkStart w:id="47" w:name="Xfac8945cbac76a366a304b79feb030a253fd04a"/>
     <w:p>
       <w:pPr>
         <w:pStyle w:val="Heading2"/>
       </w:pPr>
       <w:r>
-        <w:t xml:space="preserve">Scene 4 — Sat 08:00 · Hole 1 — tee shot đầu tiên</w:t>
+        <w:t xml:space="preserve">Tình huống 4 — Sat 08:00 · Hole 1 — tee shot đầu tiên</w:t>
       </w:r>
     </w:p>
     <w:p>
@@ -14842,13 +14835,13 @@
     </w:p>
     <w:bookmarkEnd w:id="46"/>
     <w:bookmarkEnd w:id="47"/>
-    <w:bookmarkStart w:id="49" w:name="X650598c22d2a608515bc099a6e11e682e6287e4"/>
+    <w:bookmarkStart w:id="49" w:name="X81b692c6e3acb6a23ea2139d2faea7090e7267c"/>
     <w:p>
       <w:pPr>
         <w:pStyle w:val="Heading2"/>
       </w:pPr>
       <w:r>
-        <w:t xml:space="preserve">Scene 5 — Sat 09:30 · Hole 5 — par 3 signature hole</w:t>
+        <w:t xml:space="preserve">Tình huống 5 — Sat 09:30 · Hole 5 — par 3 signature hole</w:t>
       </w:r>
     </w:p>
     <w:p>
@@ -15439,13 +15432,13 @@
     </w:p>
     <w:bookmarkEnd w:id="48"/>
     <w:bookmarkEnd w:id="49"/>
-    <w:bookmarkStart w:id="51" w:name="X8ea28669a24e97586cb51a68779592fb2125607"/>
+    <w:bookmarkStart w:id="51" w:name="X269b6c16c228408be10d56619beaefe1b45a96c"/>
     <w:p>
       <w:pPr>
         <w:pStyle w:val="Heading2"/>
       </w:pPr>
       <w:r>
-        <w:t xml:space="preserve">Scene 6 — Sat 11:00 · Hole 9 — finish front nine</w:t>
+        <w:t xml:space="preserve">Tình huống 6 — Sat 11:00 · Hole 9 — finish front nine</w:t>
       </w:r>
     </w:p>
     <w:p>
@@ -15773,7 +15766,7 @@
           <w:b/>
           <w:bCs/>
         </w:rPr>
-        <w:t xml:space="preserve">enjoy</w:t>
+        <w:t xml:space="preserve">thực sự vui</w:t>
       </w:r>
       <w:r>
         <w:t xml:space="preserve"> </w:t>
@@ -15877,13 +15870,13 @@
     </w:p>
     <w:bookmarkEnd w:id="50"/>
     <w:bookmarkEnd w:id="51"/>
-    <w:bookmarkStart w:id="53" w:name="Xb6555f9016911355d6abb44e5a9a2210099e9d2"/>
+    <w:bookmarkStart w:id="53" w:name="X510e1a5c03a7a8a1e84849bff415ae2e123ff56"/>
     <w:p>
       <w:pPr>
         <w:pStyle w:val="Heading2"/>
       </w:pPr>
       <w:r>
-        <w:t xml:space="preserve">Scene 7 — Sat 11:30 · Restaurant club house — bữa trưa</w:t>
+        <w:t xml:space="preserve">Tình huống 7 — Sat 11:30 · Restaurant club house — bữa trưa</w:t>
       </w:r>
     </w:p>
     <w:p>
@@ -16517,13 +16510,13 @@
     </w:p>
     <w:bookmarkEnd w:id="52"/>
     <w:bookmarkEnd w:id="53"/>
-    <w:bookmarkStart w:id="55" w:name="X6a6a1cada1e811b219b1e7331807eb4333df1cd"/>
+    <w:bookmarkStart w:id="55" w:name="X302fea3b6f98e9dd0dde792eaff63a14c401779"/>
     <w:p>
       <w:pPr>
         <w:pStyle w:val="Heading2"/>
       </w:pPr>
       <w:r>
-        <w:t xml:space="preserve">Scene 8 — Sat 12:30 · Hole 10 — tee off back nine</w:t>
+        <w:t xml:space="preserve">Tình huống 8 — Sat 12:30 · Hole 10 — tee off back nine</w:t>
       </w:r>
     </w:p>
     <w:p>
@@ -16856,7 +16849,7 @@
           <w:b/>
           <w:bCs/>
         </w:rPr>
-        <w:t xml:space="preserve">weather watcher mặc định</w:t>
+        <w:t xml:space="preserve">người theo dõi thời tiết mặc định</w:t>
       </w:r>
       <w:r>
         <w:t xml:space="preserve">. Check Yahoo Weather Japan / tenki.jp mỗi 1-2 hole nếu trời nghi mưa. Báo cáo ngắn cho host:</w:t>
@@ -16892,13 +16885,13 @@
     </w:p>
     <w:bookmarkEnd w:id="54"/>
     <w:bookmarkEnd w:id="55"/>
-    <w:bookmarkStart w:id="57" w:name="scene-9-sat-1400-hole-14-bunker-shot"/>
+    <w:bookmarkStart w:id="57" w:name="X17de573c6aedd29873e7cb270421399d9d8588f"/>
     <w:p>
       <w:pPr>
         <w:pStyle w:val="Heading2"/>
       </w:pPr>
       <w:r>
-        <w:t xml:space="preserve">Scene 9 — Sat 14:00 · Hole 14 — bunker shot</w:t>
+        <w:t xml:space="preserve">Tình huống 9 — Sat 14:00 · Hole 14 — bunker shot</w:t>
       </w:r>
     </w:p>
     <w:p>
@@ -17577,13 +17570,13 @@
     </w:p>
     <w:bookmarkEnd w:id="56"/>
     <w:bookmarkEnd w:id="57"/>
-    <w:bookmarkStart w:id="59" w:name="scene-10-sat-1530-hole-18-finish-round"/>
+    <w:bookmarkStart w:id="59" w:name="X82702cb2960c28a41fb5aa2b77f297109fa9e21"/>
     <w:p>
       <w:pPr>
         <w:pStyle w:val="Heading2"/>
       </w:pPr>
       <w:r>
-        <w:t xml:space="preserve">Scene 10 — Sat 15:30 · Hole 18 — finish round</w:t>
+        <w:t xml:space="preserve">Tình huống 10 — Sat 15:30 · Hole 18 — finish round</w:t>
       </w:r>
     </w:p>
     <w:p>
@@ -18209,13 +18202,13 @@
     </w:p>
     <w:bookmarkEnd w:id="58"/>
     <w:bookmarkEnd w:id="59"/>
-    <w:bookmarkStart w:id="61" w:name="X80b7afd0db7fcc6f46c341945744357f2cf0bd4"/>
+    <w:bookmarkStart w:id="61" w:name="X956fbd5a05027f6fb01a03c1fc4dd0940098ffa"/>
     <w:p>
       <w:pPr>
         <w:pStyle w:val="Heading2"/>
       </w:pPr>
       <w:r>
-        <w:t xml:space="preserve">Scene 11 — Sat 16:00 · Onsen trong club house (1.5h relax)</w:t>
+        <w:t xml:space="preserve">Tình huống 11 — Sat 16:00 · Onsen trong club house (1.5h relax)</w:t>
       </w:r>
     </w:p>
     <w:p>
@@ -18869,13 +18862,13 @@
     </w:p>
     <w:bookmarkEnd w:id="60"/>
     <w:bookmarkEnd w:id="61"/>
-    <w:bookmarkStart w:id="63" w:name="X1ff01aedb15eaaf1026da5e841eaa86b19665f1"/>
+    <w:bookmarkStart w:id="63" w:name="Xaacbbde9905bf22036dcd152027774b6b736f33"/>
     <w:p>
       <w:pPr>
         <w:pStyle w:val="Heading2"/>
       </w:pPr>
       <w:r>
-        <w:t xml:space="preserve">Scene 12 — Sat 17:30 · Lobby club house — chia tay</w:t>
+        <w:t xml:space="preserve">Tình huống 12 — Sat 17:30 · Lobby club house — chia tay</w:t>
       </w:r>
     </w:p>
     <w:p>
@@ -19972,13 +19965,13 @@
       </w:r>
     </w:p>
     <w:bookmarkEnd w:id="66"/>
-    <w:bookmarkStart w:id="68" w:name="scene-1-fri-1845-trước-izakaya-shinbashi"/>
+    <w:bookmarkStart w:id="68" w:name="X7f4403d440cea81804bc36e9c5fafa877ca3412"/>
     <w:p>
       <w:pPr>
         <w:pStyle w:val="Heading2"/>
       </w:pPr>
       <w:r>
-        <w:t xml:space="preserve">Scene 1 — Fri 18:45 · Trước izakaya Shinbashi</w:t>
+        <w:t xml:space="preserve">Tình huống 1 — Fri 18:45 · Trước izakaya Shinbashi</w:t>
       </w:r>
     </w:p>
     <w:p>
@@ -20399,13 +20392,13 @@
     </w:p>
     <w:bookmarkEnd w:id="67"/>
     <w:bookmarkEnd w:id="68"/>
-    <w:bookmarkStart w:id="70" w:name="scene-2-fri-1900-tatami-room-izakaya"/>
+    <w:bookmarkStart w:id="70" w:name="X856a7920b18f99a219cebbeb670bf458eb13632"/>
     <w:p>
       <w:pPr>
         <w:pStyle w:val="Heading2"/>
       </w:pPr>
       <w:r>
-        <w:t xml:space="preserve">Scene 2 — Fri 19:00 · Tatami room izakaya</w:t>
+        <w:t xml:space="preserve">Tình huống 2 — Fri 19:00 · Tatami room izakaya</w:t>
       </w:r>
     </w:p>
     <w:p>
@@ -20928,13 +20921,13 @@
     </w:p>
     <w:bookmarkEnd w:id="69"/>
     <w:bookmarkEnd w:id="70"/>
-    <w:bookmarkStart w:id="72" w:name="scene-3-fri-1910-bàn-tatami"/>
+    <w:bookmarkStart w:id="72" w:name="tình-huống-3-fri-1910-bàn-tatami"/>
     <w:p>
       <w:pPr>
         <w:pStyle w:val="Heading2"/>
       </w:pPr>
       <w:r>
-        <w:t xml:space="preserve">Scene 3 — Fri 19:10 · Bàn tatami</w:t>
+        <w:t xml:space="preserve">Tình huống 3 — Fri 19:10 · Bàn tatami</w:t>
       </w:r>
     </w:p>
     <w:p>
@@ -21559,13 +21552,13 @@
     </w:p>
     <w:bookmarkEnd w:id="71"/>
     <w:bookmarkEnd w:id="72"/>
-    <w:bookmarkStart w:id="74" w:name="scene-4-fri-1920-bàn-tatami"/>
+    <w:bookmarkStart w:id="74" w:name="tình-huống-4-fri-1920-bàn-tatami"/>
     <w:p>
       <w:pPr>
         <w:pStyle w:val="Heading2"/>
       </w:pPr>
       <w:r>
-        <w:t xml:space="preserve">Scene 4 — Fri 19:20 · Bàn tatami</w:t>
+        <w:t xml:space="preserve">Tình huống 4 — Fri 19:20 · Bàn tatami</w:t>
       </w:r>
     </w:p>
     <w:p>
@@ -22120,13 +22113,13 @@
     </w:p>
     <w:bookmarkEnd w:id="73"/>
     <w:bookmarkEnd w:id="74"/>
-    <w:bookmarkStart w:id="76" w:name="scene-5-fri-1940-bàn-tatami"/>
+    <w:bookmarkStart w:id="76" w:name="tình-huống-5-fri-1940-bàn-tatami"/>
     <w:p>
       <w:pPr>
         <w:pStyle w:val="Heading2"/>
       </w:pPr>
       <w:r>
-        <w:t xml:space="preserve">Scene 5 — Fri 19:40 · Bàn tatami</w:t>
+        <w:t xml:space="preserve">Tình huống 5 — Fri 19:40 · Bàn tatami</w:t>
       </w:r>
     </w:p>
     <w:p>
@@ -22626,13 +22619,13 @@
     </w:p>
     <w:bookmarkEnd w:id="75"/>
     <w:bookmarkEnd w:id="76"/>
-    <w:bookmarkStart w:id="78" w:name="scene-6-fri-2000-bàn-tatami"/>
+    <w:bookmarkStart w:id="78" w:name="tình-huống-6-fri-2000-bàn-tatami"/>
     <w:p>
       <w:pPr>
         <w:pStyle w:val="Heading2"/>
       </w:pPr>
       <w:r>
-        <w:t xml:space="preserve">Scene 6 — Fri 20:00 · Bàn tatami</w:t>
+        <w:t xml:space="preserve">Tình huống 6 — Fri 20:00 · Bàn tatami</w:t>
       </w:r>
     </w:p>
     <w:p>
@@ -23316,13 +23309,13 @@
     </w:p>
     <w:bookmarkEnd w:id="77"/>
     <w:bookmarkEnd w:id="78"/>
-    <w:bookmarkStart w:id="80" w:name="scene-7-fri-2030-bàn-tatami"/>
+    <w:bookmarkStart w:id="80" w:name="tình-huống-7-fri-2030-bàn-tatami"/>
     <w:p>
       <w:pPr>
         <w:pStyle w:val="Heading2"/>
       </w:pPr>
       <w:r>
-        <w:t xml:space="preserve">Scene 7 — Fri 20:30 · Bàn tatami</w:t>
+        <w:t xml:space="preserve">Tình huống 7 — Fri 20:30 · Bàn tatami</w:t>
       </w:r>
     </w:p>
     <w:p>
@@ -24006,13 +23999,13 @@
     </w:p>
     <w:bookmarkEnd w:id="79"/>
     <w:bookmarkEnd w:id="80"/>
-    <w:bookmarkStart w:id="82" w:name="scene-8-fri-2100-bàn-tatami"/>
+    <w:bookmarkStart w:id="82" w:name="tình-huống-8-fri-2100-bàn-tatami"/>
     <w:p>
       <w:pPr>
         <w:pStyle w:val="Heading2"/>
       </w:pPr>
       <w:r>
-        <w:t xml:space="preserve">Scene 8 — Fri 21:00 · Bàn tatami</w:t>
+        <w:t xml:space="preserve">Tình huống 8 — Fri 21:00 · Bàn tatami</w:t>
       </w:r>
     </w:p>
     <w:p>
@@ -24748,13 +24741,13 @@
     </w:p>
     <w:bookmarkEnd w:id="81"/>
     <w:bookmarkEnd w:id="82"/>
-    <w:bookmarkStart w:id="84" w:name="scene-9-fri-2130-bàn-tatami"/>
+    <w:bookmarkStart w:id="84" w:name="tình-huống-9-fri-2130-bàn-tatami"/>
     <w:p>
       <w:pPr>
         <w:pStyle w:val="Heading2"/>
       </w:pPr>
       <w:r>
-        <w:t xml:space="preserve">Scene 9 — Fri 21:30 · Bàn tatami</w:t>
+        <w:t xml:space="preserve">Tình huống 9 — Fri 21:30 · Bàn tatami</w:t>
       </w:r>
     </w:p>
     <w:p>
@@ -25398,13 +25391,13 @@
     </w:p>
     <w:bookmarkEnd w:id="83"/>
     <w:bookmarkEnd w:id="84"/>
-    <w:bookmarkStart w:id="86" w:name="Xdcf5c9201d6c91b7dc72db8b843937b4790b238"/>
+    <w:bookmarkStart w:id="86" w:name="X05673278833479b770fafa5fcc337e3b36f87ba"/>
     <w:p>
       <w:pPr>
         <w:pStyle w:val="Heading2"/>
       </w:pPr>
       <w:r>
-        <w:t xml:space="preserve">Scene 10 — Fri 22:00 · Cửa izakaya — niji-kai (tăng 2)</w:t>
+        <w:t xml:space="preserve">Tình huống 10 — Fri 22:00 · Cửa izakaya — niji-kai (tăng 2)</w:t>
       </w:r>
     </w:p>
     <w:p>
@@ -26047,13 +26040,13 @@
     </w:p>
     <w:bookmarkEnd w:id="85"/>
     <w:bookmarkEnd w:id="86"/>
-    <w:bookmarkStart w:id="88" w:name="Xe2e4516640170a1271b5618f24008690512c834"/>
+    <w:bookmarkStart w:id="88" w:name="Xf3fc107fc6bf683ba94f6739f32bed95f08c749"/>
     <w:p>
       <w:pPr>
         <w:pStyle w:val="Heading2"/>
       </w:pPr>
       <w:r>
-        <w:t xml:space="preserve">Scene 11 — Fri 22:30 · Trên đường đi karaoke (5 phút walk)</w:t>
+        <w:t xml:space="preserve">Tình huống 11 — Fri 22:30 · Trên đường đi karaoke (5 phút walk)</w:t>
       </w:r>
     </w:p>
     <w:p>
@@ -26856,7 +26849,7 @@
         <w:rPr>
           <w:rStyle w:val="VerbatimChar"/>
         </w:rPr>
-        <w:t xml:space="preserve">   → Junior cùng cty cần chủ động cover cho rookie nhất.</w:t>
+        <w:t xml:space="preserve">   → Junior cùng cty cần chủ động cover cho người mới nhất.</w:t>
       </w:r>
       <w:r>
         <w:br/>
@@ -26988,7 +26981,7 @@
         <w:rPr>
           <w:rStyle w:val="VerbatimChar"/>
         </w:rPr>
-        <w:t xml:space="preserve">- [ ] Brief Linh + Hải debrief sáng thứ 2: cái gì ổn, cái gì improve</w:t>
+        <w:t xml:space="preserve">- [ ] Tổng kết với Linh + Hải sáng thứ 2: cái gì ổn, cái gì cần cải thiện</w:t>
       </w:r>
       <w:r>
         <w:br/>
@@ -27265,13 +27258,13 @@
       </w:r>
     </w:p>
     <w:bookmarkEnd w:id="91"/>
-    <w:bookmarkStart w:id="93" w:name="Xca4b64822f60465cfb5eea83f5397b08cdfd680"/>
+    <w:bookmarkStart w:id="93" w:name="X8739ee785590bf763cda9d17d29365ad1bb76db"/>
     <w:p>
       <w:pPr>
         <w:pStyle w:val="Heading2"/>
       </w:pPr>
       <w:r>
-        <w:t xml:space="preserve">Scene 1 — Sun 22:00 · Sân bay Narita arrival, terminal 1</w:t>
+        <w:t xml:space="preserve">Tình huống 1 — Sun 22:00 · Sân bay Narita arrival, terminal 1</w:t>
       </w:r>
     </w:p>
     <w:p>
@@ -27706,13 +27699,13 @@
     </w:p>
     <w:bookmarkEnd w:id="92"/>
     <w:bookmarkEnd w:id="93"/>
-    <w:bookmarkStart w:id="95" w:name="X747353ee00e5b4b9c632e7c92e47ff4e871286c"/>
+    <w:bookmarkStart w:id="95" w:name="Xa462f0b5f50d0c12bf8c63680db54a0665b00f8"/>
     <w:p>
       <w:pPr>
         <w:pStyle w:val="Heading2"/>
       </w:pPr>
       <w:r>
-        <w:t xml:space="preserve">Scene 2 — Sun 23:30 · Hotel check-in Shinjuku (business hotel APA)</w:t>
+        <w:t xml:space="preserve">Tình huống 2 — Sun 23:30 · Hotel check-in Shinjuku (business hotel APA)</w:t>
       </w:r>
     </w:p>
     <w:p>
@@ -28381,13 +28374,13 @@
     </w:p>
     <w:bookmarkEnd w:id="94"/>
     <w:bookmarkEnd w:id="95"/>
-    <w:bookmarkStart w:id="97" w:name="Xf5e906b366eee52e640eca4860a773825c730a2"/>
+    <w:bookmarkStart w:id="97" w:name="X0f214881ab836b6d48b92d6f8950d11de2b016a"/>
     <w:p>
       <w:pPr>
         <w:pStyle w:val="Heading2"/>
       </w:pPr>
       <w:r>
-        <w:t xml:space="preserve">Scene 3 — Mon 08:30 · Sảnh Hakuō Tokyo HQ (Shimbashi area)</w:t>
+        <w:t xml:space="preserve">Tình huống 3 — Mon 08:30 · Sảnh Hakuō Tokyo HQ (Shimbashi area)</w:t>
       </w:r>
     </w:p>
     <w:p>
@@ -28960,13 +28953,13 @@
     </w:p>
     <w:bookmarkEnd w:id="96"/>
     <w:bookmarkEnd w:id="97"/>
-    <w:bookmarkStart w:id="99" w:name="X09d3b0f5c707619c4757b4f8cd48c63c1c735c2"/>
+    <w:bookmarkStart w:id="99" w:name="Xebbd951c4f6c8bbc60a0b704a6324fa09ad5d3e"/>
     <w:p>
       <w:pPr>
         <w:pStyle w:val="Heading2"/>
       </w:pPr>
       <w:r>
-        <w:t xml:space="preserve">Scene 4 — Mon 09:00 · Conference room Hakuō, kickoff Phase 5</w:t>
+        <w:t xml:space="preserve">Tình huống 4 — Mon 09:00 · Conference room Hakuō, kickoff Phase 5</w:t>
       </w:r>
     </w:p>
     <w:p>
@@ -29653,7 +29646,7 @@
         <w:pStyle w:val="FirstParagraph"/>
       </w:pPr>
       <w:r>
-        <w:t xml:space="preserve">Khách JP đôi khi ask present mà không pre-notify — test khả năng improvise:</w:t>
+        <w:t xml:space="preserve">Khách JP đôi khi yêu cầu present mà không báo trước — test khả năng ứng biến:</w:t>
       </w:r>
       <w:r>
         <w:t xml:space="preserve"> </w:t>
@@ -29810,13 +29803,13 @@
     </w:p>
     <w:bookmarkEnd w:id="98"/>
     <w:bookmarkEnd w:id="99"/>
-    <w:bookmarkStart w:id="101" w:name="scene-5-mon-1230-cafeteria-hakuō-tầng-2"/>
+    <w:bookmarkStart w:id="101" w:name="Xec53ccac8b0be71791a2746306c1ffe7824701d"/>
     <w:p>
       <w:pPr>
         <w:pStyle w:val="Heading2"/>
       </w:pPr>
       <w:r>
-        <w:t xml:space="preserve">Scene 5 — Mon 12:30 · Cafeteria Hakuō (tầng 2)</w:t>
+        <w:t xml:space="preserve">Tình huống 5 — Mon 12:30 · Cafeteria Hakuō (tầng 2)</w:t>
       </w:r>
     </w:p>
     <w:p>
@@ -30483,13 +30476,13 @@
     </w:p>
     <w:bookmarkEnd w:id="100"/>
     <w:bookmarkEnd w:id="101"/>
-    <w:bookmarkStart w:id="103" w:name="X1ae1799c9426ba300b6e3168972a99ecbdd56d6"/>
+    <w:bookmarkStart w:id="103" w:name="Xc3d7c779ced8f85d0b806922017c132893b5002"/>
     <w:p>
       <w:pPr>
         <w:pStyle w:val="Heading2"/>
       </w:pPr>
       <w:r>
-        <w:t xml:space="preserve">Scene 6 — Tue 14:00 · Tokyo office floor 8 — engineering team</w:t>
+        <w:t xml:space="preserve">Tình huống 6 — Tue 14:00 · Tokyo office floor 8 — engineering team</w:t>
       </w:r>
     </w:p>
     <w:p>
@@ -31146,13 +31139,13 @@
     </w:p>
     <w:bookmarkEnd w:id="102"/>
     <w:bookmarkEnd w:id="103"/>
-    <w:bookmarkStart w:id="105" w:name="X280b29f84b28481bc85dd399c93a2555b4a1641"/>
+    <w:bookmarkStart w:id="105" w:name="X616c6def170692d3a1c859b37ed0efbaaf62b77"/>
     <w:p>
       <w:pPr>
         <w:pStyle w:val="Heading2"/>
       </w:pPr>
       <w:r>
-        <w:t xml:space="preserve">Scene 7 — Wed 19:00 · Izakaya Roppongi với Matsumoto + 2 colleagues</w:t>
+        <w:t xml:space="preserve">Tình huống 7 — Wed 19:00 · Izakaya Roppongi với Matsumoto + 2 colleagues</w:t>
       </w:r>
     </w:p>
     <w:p>
@@ -31933,13 +31926,13 @@
     </w:p>
     <w:bookmarkEnd w:id="104"/>
     <w:bookmarkEnd w:id="105"/>
-    <w:bookmarkStart w:id="107" w:name="scene-8-thu-1000-phòng-nakamura-cfo"/>
+    <w:bookmarkStart w:id="107" w:name="tình-huống-8-thu-1000-phòng-nakamura-cfo"/>
     <w:p>
       <w:pPr>
         <w:pStyle w:val="Heading2"/>
       </w:pPr>
       <w:r>
-        <w:t xml:space="preserve">Scene 8 — Thu 10:00 · Phòng Nakamura CFO</w:t>
+        <w:t xml:space="preserve">Tình huống 8 — Thu 10:00 · Phòng Nakamura CFO</w:t>
       </w:r>
     </w:p>
     <w:p>
@@ -32684,13 +32677,13 @@
     </w:p>
     <w:bookmarkEnd w:id="106"/>
     <w:bookmarkEnd w:id="107"/>
-    <w:bookmarkStart w:id="109" w:name="X9c4535f766d79ef0777657dfcdccb70cda0f7f0"/>
+    <w:bookmarkStart w:id="109" w:name="X144c6d7266cb728c46f29fed5a284e67d0005fa"/>
     <w:p>
       <w:pPr>
         <w:pStyle w:val="Heading2"/>
       </w:pPr>
       <w:r>
-        <w:t xml:space="preserve">Scene 9 — Thu 18:00 · Convenience store FamilyMart gần hotel</w:t>
+        <w:t xml:space="preserve">Tình huống 9 — Thu 18:00 · Convenience store FamilyMart gần hotel</w:t>
       </w:r>
     </w:p>
     <w:p>
@@ -33248,13 +33241,13 @@
     </w:p>
     <w:bookmarkEnd w:id="108"/>
     <w:bookmarkEnd w:id="109"/>
-    <w:bookmarkStart w:id="111" w:name="Xc3c76bfe5d6f2dff9904ef95023b7e5d3c9b897"/>
+    <w:bookmarkStart w:id="111" w:name="X5ac1cb337f434b22623186ccb0b3fa5ee6d5195"/>
     <w:p>
       <w:pPr>
         <w:pStyle w:val="Heading2"/>
       </w:pPr>
       <w:r>
-        <w:t xml:space="preserve">Scene 10 — Fri 09:30 · Conference room — closing meeting</w:t>
+        <w:t xml:space="preserve">Tình huống 10 — Fri 09:30 · Conference room — closing meeting</w:t>
       </w:r>
     </w:p>
     <w:p>
@@ -33463,7 +33456,7 @@
                 <w:i/>
                 <w:iCs/>
               </w:rPr>
-              <w:t xml:space="preserve">Dũng à, trong period chuẩn bị Phase 5 qua thêm 1 lần nữa được không? Đầu tháng 10 chẳng hạn. Đề xuất Slack channel mình muốn close face-to-face.</w:t>
+              <w:t xml:space="preserve">Dũng à, trong period chuẩn bị Phase 5 qua thêm 1 lần nữa được không? Đầu tháng 10 chẳng hạn. Đề xuất Slack channel mình muốn bàn trực tiếp.</w:t>
             </w:r>
           </w:p>
         </w:tc>
@@ -33758,7 +33751,7 @@
                 <w:i/>
                 <w:iCs/>
               </w:rPr>
-              <w:t xml:space="preserve">. (3) Bài present surprise thứ 2 dạy em phải luyện improv response.</w:t>
+              <w:t xml:space="preserve">. (3) Bài present surprise thứ 2 dạy em phải luyện khả năng ứng biến.</w:t>
             </w:r>
           </w:p>
         </w:tc>
@@ -33920,7 +33913,7 @@
         <w:t xml:space="preserve"> </w:t>
       </w:r>
       <w:r>
-        <w:t xml:space="preserve">— pointer điểm yếu (improv response, tech depth) = mature.</w:t>
+        <w:t xml:space="preserve">— pointer điểm yếu (khả năng ứng biến, tech depth) = mature.</w:t>
       </w:r>
       <w:r>
         <w:t xml:space="preserve"> </w:t>
@@ -34003,13 +33996,13 @@
     </w:p>
     <w:bookmarkEnd w:id="110"/>
     <w:bookmarkEnd w:id="111"/>
-    <w:bookmarkStart w:id="113" w:name="scene-11-fri-1200-sảnh-chia-tay-hakuō-hq"/>
+    <w:bookmarkStart w:id="113" w:name="X8089035923b9f51381756992ecff1965c832679"/>
     <w:p>
       <w:pPr>
         <w:pStyle w:val="Heading2"/>
       </w:pPr>
       <w:r>
-        <w:t xml:space="preserve">Scene 11 — Fri 12:00 · Sảnh chia tay Hakuō HQ</w:t>
+        <w:t xml:space="preserve">Tình huống 11 — Fri 12:00 · Sảnh chia tay Hakuō HQ</w:t>
       </w:r>
     </w:p>
     <w:p>
@@ -34644,13 +34637,13 @@
     </w:p>
     <w:bookmarkEnd w:id="112"/>
     <w:bookmarkEnd w:id="113"/>
-    <w:bookmarkStart w:id="115" w:name="scene-12-fri-1900-don-quijote-shinjuku"/>
+    <w:bookmarkStart w:id="115" w:name="Xc1d62d9b83bf06074c71c5c83a3373dcc3df729"/>
     <w:p>
       <w:pPr>
         <w:pStyle w:val="Heading2"/>
       </w:pPr>
       <w:r>
-        <w:t xml:space="preserve">Scene 12 — Fri 19:00 · Don Quijote Shinjuku</w:t>
+        <w:t xml:space="preserve">Tình huống 12 — Fri 19:00 · Don Quijote Shinjuku</w:t>
       </w:r>
     </w:p>
     <w:p>
@@ -34951,7 +34944,7 @@
         <w:t xml:space="preserve"> </w:t>
       </w:r>
       <w:r>
-        <w:t xml:space="preserve">= one-stop, đủ giá.</w:t>
+        <w:t xml:space="preserve">= mua một chỗ, đủ giá.</w:t>
       </w:r>
       <w:r>
         <w:t xml:space="preserve"> </w:t>
@@ -35035,13 +35028,13 @@
     </w:p>
     <w:bookmarkEnd w:id="114"/>
     <w:bookmarkEnd w:id="115"/>
-    <w:bookmarkStart w:id="117" w:name="X4d38732181f762b30c497cb22e03f1de2dbf307"/>
+    <w:bookmarkStart w:id="117" w:name="X8a731e43d62db80c58cb2edb65ff17bcc4caffc"/>
     <w:p>
       <w:pPr>
         <w:pStyle w:val="Heading2"/>
       </w:pPr>
       <w:r>
-        <w:t xml:space="preserve">Scene 13 — Sat 06:00 · Hotel check-out → Narita Express</w:t>
+        <w:t xml:space="preserve">Tình huống 13 — Sat 06:00 · Hotel check-out → Narita Express</w:t>
       </w:r>
     </w:p>
     <w:p>
@@ -35602,13 +35595,13 @@
     </w:p>
     <w:bookmarkEnd w:id="116"/>
     <w:bookmarkEnd w:id="117"/>
-    <w:bookmarkStart w:id="119" w:name="X1f6424814f33cf3b32708c7869691d37aa49e74"/>
+    <w:bookmarkStart w:id="119" w:name="X5d053857f8d2dd154dd5e51677295d52b15b808"/>
     <w:p>
       <w:pPr>
         <w:pStyle w:val="Heading2"/>
       </w:pPr>
       <w:r>
-        <w:t xml:space="preserve">Scene 14 — Sat 14:00 · Trên máy bay JAL về HCMC</w:t>
+        <w:t xml:space="preserve">Tình huống 14 — Sat 14:00 · Trên máy bay JAL về HCMC</w:t>
       </w:r>
     </w:p>
     <w:p>
@@ -35925,7 +35918,7 @@
         <w:t xml:space="preserve"> </w:t>
       </w:r>
       <w:r>
-        <w:t xml:space="preserve">- ✅ Tải sẵn 1 video / podcast học liên quan — biến flight thành productive hour.</w:t>
+        <w:t xml:space="preserve">- ✅ Tải sẵn 1 video / podcast học liên quan — biến chuyến bay thành giờ học hiệu quả.</w:t>
       </w:r>
       <w:r>
         <w:t xml:space="preserve"> </w:t>
@@ -35993,7 +35986,7 @@
         <w:rPr>
           <w:rStyle w:val="VerbatimChar"/>
         </w:rPr>
-        <w:t xml:space="preserve">1. Mon kickoff present surprise — improv 5 phút OK với rule of 3.</w:t>
+        <w:t xml:space="preserve">1. Mon kickoff present surprise — ứng biến 5 phút OK với rule of 3.</w:t>
       </w:r>
       <w:r>
         <w:br/>
@@ -36482,7 +36475,7 @@
         </w:numPr>
       </w:pPr>
       <w:r>
-        <w:t xml:space="preserve">Khách JP shock nhẹ với HCMC: traffic, nhiệt độ, đồ ăn cay, cúp điện. Coach trước qua mail.</w:t>
+        <w:t xml:space="preserve">Khách JP ngạc nhiên / choáng nhẹ với HCMC: traffic, nhiệt độ, đồ ăn cay, cúp điện. Coach trước qua mail.</w:t>
       </w:r>
     </w:p>
     <w:p>
@@ -36541,13 +36534,13 @@
       </w:r>
     </w:p>
     <w:bookmarkEnd w:id="122"/>
-    <w:bookmarkStart w:id="124" w:name="X86a145fd373b1170b926a34bd1096d7cd2e856f"/>
+    <w:bookmarkStart w:id="124" w:name="Xa93bd70296555f3e7cb7cea4d458cc6e3b0f29a"/>
     <w:p>
       <w:pPr>
         <w:pStyle w:val="Heading2"/>
       </w:pPr>
       <w:r>
-        <w:t xml:space="preserve">Scene 1 — Mon 18:00 · Sân bay Tân Sơn Nhất arrival, terminal 2</w:t>
+        <w:t xml:space="preserve">Tình huống 1 — Mon 18:00 · Sân bay Tân Sơn Nhất arrival, terminal 2</w:t>
       </w:r>
     </w:p>
     <w:p>
@@ -37824,13 +37817,13 @@
     </w:p>
     <w:bookmarkEnd w:id="123"/>
     <w:bookmarkEnd w:id="124"/>
-    <w:bookmarkStart w:id="126" w:name="Xfed6e4214a613436f686e5a2b658e832cdb51a9"/>
+    <w:bookmarkStart w:id="126" w:name="X60bfb8cb0854119bdd6cb255924e9af2769ede9"/>
     <w:p>
       <w:pPr>
         <w:pStyle w:val="Heading2"/>
       </w:pPr>
       <w:r>
-        <w:t xml:space="preserve">Scene 2 — Mon 19:30 · Xe van 8 chỗ từ sân bay về quận 1 (45 phút giờ tan tầm)</w:t>
+        <w:t xml:space="preserve">Tình huống 2 — Mon 19:30 · Xe van 8 chỗ từ sân bay về quận 1 (45 phút giờ tan tầm)</w:t>
       </w:r>
     </w:p>
     <w:p>
@@ -37842,7 +37835,7 @@
           <w:i/>
           <w:iCs/>
         </w:rPr>
-        <w:t xml:space="preserve">Xe Innova Toyota của cty thuê, máy lạnh mạnh. Đoàn JP ngồi đầy. Traffic 18:30 sân bay TSN → quận 1 đông kinh khủng. Mật độ xe máy shock người Nhật.</w:t>
+        <w:t xml:space="preserve">Xe Innova Toyota của cty thuê, máy lạnh mạnh. Đoàn JP ngồi đầy. Traffic 18:30 sân bay TSN → quận 1 đông kinh khủng. Mật độ xe máy khiến người Nhật choáng.</w:t>
       </w:r>
     </w:p>
     <w:tbl>
@@ -38330,13 +38323,13 @@
         </w:tc>
       </w:tr>
     </w:tbl>
-    <w:bookmarkStart w:id="125" w:name="X4bc3c3cc0d98bfdea41cb3c30e826c2aeac32c5"/>
+    <w:bookmarkStart w:id="125" w:name="Xff954b50a90b58bea67bb480b11407db70449c0"/>
     <w:p>
       <w:pPr>
         <w:pStyle w:val="Heading3"/>
       </w:pPr>
       <w:r>
-        <w:t xml:space="preserve">💡 Bí quyết — Khách JP shock với HCMC — anticipate + explain calm</w:t>
+        <w:t xml:space="preserve">💡 Bí quyết — Khách JP choáng với HCMC — anticipate + explain calm</w:t>
       </w:r>
     </w:p>
     <w:p>
@@ -38344,7 +38337,7 @@
         <w:pStyle w:val="FirstParagraph"/>
       </w:pPr>
       <w:r>
-        <w:t xml:space="preserve">Khách JP first time HCMC thường shock 3 thứ:</w:t>
+        <w:t xml:space="preserve">Khách JP first time HCMC thường choáng 3 thứ:</w:t>
       </w:r>
       <w:r>
         <w:t xml:space="preserve"> </w:t>
@@ -38452,7 +38445,7 @@
         <w:t xml:space="preserve"> </w:t>
       </w:r>
       <w:r>
-        <w:t xml:space="preserve">— preempt shock.</w:t>
+        <w:t xml:space="preserve">— preempt bất ngờ.</w:t>
       </w:r>
       <w:r>
         <w:t xml:space="preserve"> </w:t>
@@ -38548,13 +38541,13 @@
     </w:p>
     <w:bookmarkEnd w:id="125"/>
     <w:bookmarkEnd w:id="126"/>
-    <w:bookmarkStart w:id="128" w:name="X5537aad837c8b203f67cda48454e04a87f648bb"/>
+    <w:bookmarkStart w:id="128" w:name="Xdf6acf89707440253f4b41a71339354ea287052"/>
     <w:p>
       <w:pPr>
         <w:pStyle w:val="Heading2"/>
       </w:pPr>
       <w:r>
-        <w:t xml:space="preserve">Scene 3 — Mon 20:30 · Welcome dinner — Quán Cuc Gach Quan (quận 1)</w:t>
+        <w:t xml:space="preserve">Tình huống 3 — Mon 20:30 · Welcome dinner — Quán Cuc Gach Quan (quận 1)</w:t>
       </w:r>
     </w:p>
     <w:p>
@@ -39461,13 +39454,13 @@
     </w:p>
     <w:bookmarkEnd w:id="127"/>
     <w:bookmarkEnd w:id="128"/>
-    <w:bookmarkStart w:id="130" w:name="X9b6568804857b6166ca67c33f4f62d06db132da"/>
+    <w:bookmarkStart w:id="130" w:name="X224829962dc0ccdce6456ebbc9e0863b96be200"/>
     <w:p>
       <w:pPr>
         <w:pStyle w:val="Heading2"/>
       </w:pPr>
       <w:r>
-        <w:t xml:space="preserve">Scene 4 — Tue 09:00 · Văn phòng Thiên Phát quận 7</w:t>
+        <w:t xml:space="preserve">Tình huống 4 — Tue 09:00 · Văn phòng Thiên Phát quận 7</w:t>
       </w:r>
     </w:p>
     <w:p>
@@ -40214,7 +40207,7 @@
         <w:t xml:space="preserve">In-moment calm</w:t>
       </w:r>
       <w:r>
-        <w:t xml:space="preserve">: Hà CTO + Dũng calm explain → khách shock turn into ấn tượng (Matsumoto:</w:t>
+        <w:t xml:space="preserve">: Hà CTO + Dũng calm explain → khách choáng turn into ấn tượng (Matsumoto:</w:t>
       </w:r>
       <w:r>
         <w:t xml:space="preserve"> </w:t>
@@ -40239,7 +40232,7 @@
           <w:b/>
           <w:bCs/>
         </w:rPr>
-        <w:t xml:space="preserve">Pivot to BCP narrative</w:t>
+        <w:t xml:space="preserve">Chuyển hướng sang câu chuyện BCP</w:t>
       </w:r>
       <w:r>
         <w:t xml:space="preserve">:</w:t>
@@ -40311,13 +40304,13 @@
     </w:p>
     <w:bookmarkEnd w:id="129"/>
     <w:bookmarkEnd w:id="130"/>
-    <w:bookmarkStart w:id="132" w:name="scene-5-tue-1100-phòng-họp-lớn"/>
+    <w:bookmarkStart w:id="132" w:name="tình-huống-5-tue-1100-phòng-họp-lớn"/>
     <w:p>
       <w:pPr>
         <w:pStyle w:val="Heading2"/>
       </w:pPr>
       <w:r>
-        <w:t xml:space="preserve">Scene 5 — Tue 11:00 · Phòng họp lớn</w:t>
+        <w:t xml:space="preserve">Tình huống 5 — Tue 11:00 · Phòng họp lớn</w:t>
       </w:r>
     </w:p>
     <w:p>
@@ -41060,13 +41053,13 @@
     </w:p>
     <w:bookmarkEnd w:id="131"/>
     <w:bookmarkEnd w:id="132"/>
-    <w:bookmarkStart w:id="134" w:name="X12127f9f337c7d8ab26e9c2ac10c35bcf92ba65"/>
+    <w:bookmarkStart w:id="134" w:name="X2a97d428147660cadad6107fb4b4c4346550592"/>
     <w:p>
       <w:pPr>
         <w:pStyle w:val="Heading2"/>
       </w:pPr>
       <w:r>
-        <w:t xml:space="preserve">Scene 6 — Tue 12:30 · Phở quán bình dân gần office</w:t>
+        <w:t xml:space="preserve">Tình huống 6 — Tue 12:30 · Phở quán bình dân gần office</w:t>
       </w:r>
     </w:p>
     <w:p>
@@ -41726,13 +41719,13 @@
     </w:p>
     <w:bookmarkEnd w:id="133"/>
     <w:bookmarkEnd w:id="134"/>
-    <w:bookmarkStart w:id="136" w:name="Xdcc200164374f67285741c36665bc6acc13ebc8"/>
+    <w:bookmarkStart w:id="136" w:name="Xcb929ebed85f67a4cb2017d73a5a49837890d63"/>
     <w:p>
       <w:pPr>
         <w:pStyle w:val="Heading2"/>
       </w:pPr>
       <w:r>
-        <w:t xml:space="preserve">Scene 7 — Tue 18:00 · Rooftop bar Saigon Saigon (Caravelle Hotel) view sông Saigon</w:t>
+        <w:t xml:space="preserve">Tình huống 7 — Tue 18:00 · Rooftop bar Saigon Saigon (Caravelle Hotel) view sông Saigon</w:t>
       </w:r>
     </w:p>
     <w:p>
@@ -42373,13 +42366,13 @@
         <w:t xml:space="preserve">[19:15 mưa tạnh hẳn. Đoàn ra rooftop lại — mặt trời lặn rực rỡ ngang Saigon River. Không có cầu vồng nhưng sky orange-pink. Đoàn JP đứng chụp ảnh 10 phút.]</w:t>
       </w:r>
     </w:p>
-    <w:bookmarkStart w:id="135" w:name="bí-quyết-mưa-bất-ngờ-pivot-smooth"/>
+    <w:bookmarkStart w:id="135" w:name="bí-quyết-mưa-bất-ngờ-chuyển-hướng-khéo"/>
     <w:p>
       <w:pPr>
         <w:pStyle w:val="Heading3"/>
       </w:pPr>
       <w:r>
-        <w:t xml:space="preserve">💡 Bí quyết — Mưa bất ngờ = pivot smooth</w:t>
+        <w:t xml:space="preserve">💡 Bí quyết — Mưa bất ngờ = chuyển hướng khéo</w:t>
       </w:r>
     </w:p>
     <w:p>
@@ -42403,7 +42396,7 @@
           <w:b/>
           <w:bCs/>
         </w:rPr>
-        <w:t xml:space="preserve">Hương + Tuấn pivot ngay</w:t>
+        <w:t xml:space="preserve">Hương + Tuấn chuyển hướng ngay</w:t>
       </w:r>
       <w:r>
         <w:t xml:space="preserve"> </w:t>
@@ -42520,13 +42513,13 @@
     </w:p>
     <w:bookmarkEnd w:id="135"/>
     <w:bookmarkEnd w:id="136"/>
-    <w:bookmarkStart w:id="138" w:name="X295e80664a43e73c8693756c0b0de4238dae78c"/>
+    <w:bookmarkStart w:id="138" w:name="X663192fc46f00bfb809a59715f1dee456f6cfe1"/>
     <w:p>
       <w:pPr>
         <w:pStyle w:val="Heading2"/>
       </w:pPr>
       <w:r>
-        <w:t xml:space="preserve">Scene 8 — Wed 08:30 · Văn phòng Thiên Phát — phòng họp tech</w:t>
+        <w:t xml:space="preserve">Tình huống 8 — Wed 08:30 · Văn phòng Thiên Phát — phòng họp tech</w:t>
       </w:r>
     </w:p>
     <w:p>
@@ -43323,13 +43316,13 @@
     </w:p>
     <w:bookmarkEnd w:id="137"/>
     <w:bookmarkEnd w:id="138"/>
-    <w:bookmarkStart w:id="140" w:name="X025198ab011b497a0c78a0bcd71d77083686cbb"/>
+    <w:bookmarkStart w:id="140" w:name="Xb8ba8251f8eab95eaf177c8a2bb08f6307d5fa7"/>
     <w:p>
       <w:pPr>
         <w:pStyle w:val="Heading2"/>
       </w:pPr>
       <w:r>
-        <w:t xml:space="preserve">Scene 9 — Wed 12:00 · Cơm tấm quán bình dân gần office</w:t>
+        <w:t xml:space="preserve">Tình huống 9 — Wed 12:00 · Cơm tấm quán bình dân gần office</w:t>
       </w:r>
     </w:p>
     <w:p>
@@ -44083,13 +44076,13 @@
     </w:p>
     <w:bookmarkEnd w:id="139"/>
     <w:bookmarkEnd w:id="140"/>
-    <w:bookmarkStart w:id="142" w:name="Xeada368f09589430ca8634132b104b62a917df6"/>
+    <w:bookmarkStart w:id="142" w:name="Xa43507ed0a8530f004d0f58153190f00f7deae3"/>
     <w:p>
       <w:pPr>
         <w:pStyle w:val="Heading2"/>
       </w:pPr>
       <w:r>
-        <w:t xml:space="preserve">Scene 10 — Wed 15:00 · Phòng Hà CTO — meeting executive</w:t>
+        <w:t xml:space="preserve">Tình huống 10 — Wed 15:00 · Phòng Hà CTO — meeting executive</w:t>
       </w:r>
     </w:p>
     <w:p>
@@ -44997,13 +44990,13 @@
     </w:p>
     <w:bookmarkEnd w:id="141"/>
     <w:bookmarkEnd w:id="142"/>
-    <w:bookmarkStart w:id="144" w:name="X413e30676b6c97fdde4a78f041a857ce337f274"/>
+    <w:bookmarkStart w:id="144" w:name="X2953239f732bb62e6e10c640968940b37c1d037"/>
     <w:p>
       <w:pPr>
         <w:pStyle w:val="Heading2"/>
       </w:pPr>
       <w:r>
-        <w:t xml:space="preserve">Scene 11 — Wed 19:00 · Bia Saigon street stall quận 4, hải sản</w:t>
+        <w:t xml:space="preserve">Tình huống 11 — Wed 19:00 · Bia Saigon street stall quận 4, hải sản</w:t>
       </w:r>
     </w:p>
     <w:p>
@@ -45779,13 +45772,13 @@
     </w:p>
     <w:bookmarkEnd w:id="143"/>
     <w:bookmarkEnd w:id="144"/>
-    <w:bookmarkStart w:id="146" w:name="Xad5810b115384b32ef215005d7d4ea8bce3bc5c"/>
+    <w:bookmarkStart w:id="146" w:name="X8ea659f9871e845db128a5d094c10751e0fbc46"/>
     <w:p>
       <w:pPr>
         <w:pStyle w:val="Heading2"/>
       </w:pPr>
       <w:r>
-        <w:t xml:space="preserve">Scene 12 — Thu 09:00 · Phòng họp lớn Thiên Phát</w:t>
+        <w:t xml:space="preserve">Tình huống 12 — Thu 09:00 · Phòng họp lớn Thiên Phát</w:t>
       </w:r>
     </w:p>
     <w:p>
@@ -46402,13 +46395,13 @@
     </w:p>
     <w:bookmarkEnd w:id="145"/>
     <w:bookmarkEnd w:id="146"/>
-    <w:bookmarkStart w:id="148" w:name="X8562ca227ccf4db2253877d63910b886ed03429"/>
+    <w:bookmarkStart w:id="148" w:name="X75ebf1b91df9362f0fe89d9cf2c031b91e1d72f"/>
     <w:p>
       <w:pPr>
         <w:pStyle w:val="Heading2"/>
       </w:pPr>
       <w:r>
-        <w:t xml:space="preserve">Scene 13 — Thu 17:00 · Sân bay Tân Sơn Nhất departure</w:t>
+        <w:t xml:space="preserve">Tình huống 13 — Thu 17:00 · Sân bay Tân Sơn Nhất departure</w:t>
       </w:r>
     </w:p>
     <w:p>
@@ -47219,7 +47212,7 @@
         <w:rPr>
           <w:rStyle w:val="VerbatimChar"/>
         </w:rPr>
-        <w:t xml:space="preserve">1. Cúp điện Tue 11h — Hà CTO + em pivot calm, BCP narrative,</w:t>
+        <w:t xml:space="preserve">1. Cúp điện Tue 11h — Hà CTO + em chuyển hướng bình tĩnh, câu chuyện BCP,</w:t>
       </w:r>
       <w:r>
         <w:br/>
@@ -47422,7 +47415,7 @@
         <w:rPr>
           <w:rStyle w:val="VerbatimChar"/>
         </w:rPr>
-        <w:t xml:space="preserve">- [ ] Note BCP narrative — viết case study 1-page bán cho khách JP khác</w:t>
+        <w:t xml:space="preserve">- [ ] Note câu chuyện BCP — viết case study 1-page bán cho khách JP khác</w:t>
       </w:r>
       <w:r>
         <w:br/>
@@ -47725,13 +47718,13 @@
       </w:r>
     </w:p>
     <w:bookmarkEnd w:id="151"/>
-    <w:bookmarkStart w:id="153" w:name="Xdad7afe9818d1ddf562e76911fa5cee5ae761c2"/>
+    <w:bookmarkStart w:id="153" w:name="X3d72a33377ad41e8e51e1fa918337a8b60f94bc"/>
     <w:p>
       <w:pPr>
         <w:pStyle w:val="Heading2"/>
       </w:pPr>
       <w:r>
-        <w:t xml:space="preserve">Scene 1 — Sat 09:00 · Ga Tokyo Shinkansen platform, Tōkaidō line</w:t>
+        <w:t xml:space="preserve">Tình huống 1 — Sat 09:00 · Ga Tokyo Shinkansen platform, Tōkaidō line</w:t>
       </w:r>
     </w:p>
     <w:p>
@@ -48169,13 +48162,13 @@
     </w:p>
     <w:bookmarkEnd w:id="152"/>
     <w:bookmarkEnd w:id="153"/>
-    <w:bookmarkStart w:id="155" w:name="Xf1dd4a3355a723a51d065888b48c5234babb4a8"/>
+    <w:bookmarkStart w:id="155" w:name="Xb04d399ea3daa09172447aebe1c2fd9e3f02f24"/>
     <w:p>
       <w:pPr>
         <w:pStyle w:val="Heading2"/>
       </w:pPr>
       <w:r>
-        <w:t xml:space="preserve">Scene 2 — Sat 09:45 · Trên Shinkansen Kodama 627, toa 3</w:t>
+        <w:t xml:space="preserve">Tình huống 2 — Sat 09:45 · Trên Shinkansen Kodama 627, toa 3</w:t>
       </w:r>
     </w:p>
     <w:p>
@@ -48974,13 +48967,13 @@
     </w:p>
     <w:bookmarkEnd w:id="154"/>
     <w:bookmarkEnd w:id="155"/>
-    <w:bookmarkStart w:id="157" w:name="scene-3-sat-1030-ga-atami-arrival"/>
+    <w:bookmarkStart w:id="157" w:name="tình-huống-3-sat-1030-ga-atami-arrival"/>
     <w:p>
       <w:pPr>
         <w:pStyle w:val="Heading2"/>
       </w:pPr>
       <w:r>
-        <w:t xml:space="preserve">Scene 3 — Sat 10:30 · Ga Atami arrival</w:t>
+        <w:t xml:space="preserve">Tình huống 3 — Sat 10:30 · Ga Atami arrival</w:t>
       </w:r>
     </w:p>
     <w:p>
@@ -49632,13 +49625,13 @@
     </w:p>
     <w:bookmarkEnd w:id="156"/>
     <w:bookmarkEnd w:id="157"/>
-    <w:bookmarkStart w:id="159" w:name="X7a1e05253207f6b8cd47dca0c8f2d246f58b59b"/>
+    <w:bookmarkStart w:id="159" w:name="Xb39c67cb0a5dda1f9c76cb725d1c7f4574dfd65"/>
     <w:p>
       <w:pPr>
         <w:pStyle w:val="Heading2"/>
       </w:pPr>
       <w:r>
-        <w:t xml:space="preserve">Scene 4 — Sat 11:00 · Ryokan check-in lobby (Ryokan </w:t>
+        <w:t xml:space="preserve">Tình huống 4 — Sat 11:00 · Ryokan check-in lobby (Ryokan </w:t>
       </w:r>
       <w:r>
         <w:rPr>
@@ -50354,13 +50347,13 @@
     </w:p>
     <w:bookmarkEnd w:id="158"/>
     <w:bookmarkEnd w:id="159"/>
-    <w:bookmarkStart w:id="161" w:name="Xefd6a170dd86aaccf33344114f15d21016109a5"/>
+    <w:bookmarkStart w:id="161" w:name="X90868f52852c8541167ca787bc18cff94e7257b"/>
     <w:p>
       <w:pPr>
         <w:pStyle w:val="Heading2"/>
       </w:pPr>
       <w:r>
-        <w:t xml:space="preserve">Scene 5 — Sat 12:30 · Phòng tatami chung</w:t>
+        <w:t xml:space="preserve">Tình huống 5 — Sat 12:30 · Phòng tatami chung</w:t>
       </w:r>
       <w:r>
         <w:t xml:space="preserve"> </w:t>
@@ -51171,13 +51164,13 @@
     </w:p>
     <w:bookmarkEnd w:id="160"/>
     <w:bookmarkEnd w:id="161"/>
-    <w:bookmarkStart w:id="163" w:name="Xe904ca4fe7c7691903350112afd15161fbf1911"/>
+    <w:bookmarkStart w:id="163" w:name="X90a4cbf73b184f6191c5a6a04b42780bfd04b4f"/>
     <w:p>
       <w:pPr>
         <w:pStyle w:val="Heading2"/>
       </w:pPr>
       <w:r>
-        <w:t xml:space="preserve">Scene 6 — Sat 15:00 · Onsen ngoài trời (rotenburo) — bồn lớn nhìn ra biển</w:t>
+        <w:t xml:space="preserve">Tình huống 6 — Sat 15:00 · Onsen ngoài trời (rotenburo) — bồn lớn nhìn ra biển</w:t>
       </w:r>
     </w:p>
     <w:p>
@@ -51909,13 +51902,13 @@
     </w:p>
     <w:bookmarkEnd w:id="162"/>
     <w:bookmarkEnd w:id="163"/>
-    <w:bookmarkStart w:id="165" w:name="Xa79acfa535325cf591c3ab4ee496b1a843c7545"/>
+    <w:bookmarkStart w:id="165" w:name="Xc6e68a76fa6aa5e632cb72e87e9d55a7700e87a"/>
     <w:p>
       <w:pPr>
         <w:pStyle w:val="Heading2"/>
       </w:pPr>
       <w:r>
-        <w:t xml:space="preserve">Scene 7 — Sat 17:00 · Sảnh ryokan, trà chiều với wagashi</w:t>
+        <w:t xml:space="preserve">Tình huống 7 — Sat 17:00 · Sảnh ryokan, trà chiều với wagashi</w:t>
       </w:r>
     </w:p>
     <w:p>
@@ -52640,13 +52633,13 @@
     </w:p>
     <w:bookmarkEnd w:id="164"/>
     <w:bookmarkEnd w:id="165"/>
-    <w:bookmarkStart w:id="167" w:name="X1433f939719d8dc9e9e9356c5bd785cefb7e7c9"/>
+    <w:bookmarkStart w:id="167" w:name="X93a5beaba185cf3a09a8d5c03933f7b997327f4"/>
     <w:p>
       <w:pPr>
         <w:pStyle w:val="Heading2"/>
       </w:pPr>
       <w:r>
-        <w:t xml:space="preserve">Scene 8 — Sat 19:00 · Phòng tatami — kaiseki dinner 12 món</w:t>
+        <w:t xml:space="preserve">Tình huống 8 — Sat 19:00 · Phòng tatami — kaiseki dinner 12 món</w:t>
       </w:r>
     </w:p>
     <w:p>
@@ -53502,13 +53495,13 @@
     </w:p>
     <w:bookmarkEnd w:id="166"/>
     <w:bookmarkEnd w:id="167"/>
-    <w:bookmarkStart w:id="169" w:name="Xc8b0551c8de6d05fa78aa05058d08494154c760"/>
+    <w:bookmarkStart w:id="169" w:name="X05f36da1cf266192278f96acede4cbebacf4351"/>
     <w:p>
       <w:pPr>
         <w:pStyle w:val="Heading2"/>
       </w:pPr>
       <w:r>
-        <w:t xml:space="preserve">Scene 9 — Sat 21:00 · Onsen indoor lần 2 (sau dinner)</w:t>
+        <w:t xml:space="preserve">Tình huống 9 — Sat 21:00 · Onsen indoor lần 2 (sau dinner)</w:t>
       </w:r>
     </w:p>
     <w:p>
@@ -54308,7 +54301,7 @@
         <w:t xml:space="preserve"> </w:t>
       </w:r>
       <w:r>
-        <w:t xml:space="preserve">- Vì alcohol nhẹ + warm water → relax.</w:t>
+        <w:t xml:space="preserve">- Vì alcohol nhẹ + warm water → thư giãn.</w:t>
       </w:r>
       <w:r>
         <w:t xml:space="preserve"> </w:t>
@@ -54509,13 +54502,13 @@
     </w:p>
     <w:bookmarkEnd w:id="168"/>
     <w:bookmarkEnd w:id="169"/>
-    <w:bookmarkStart w:id="171" w:name="scene-10-sat-2230-phòng-tatami-futon"/>
+    <w:bookmarkStart w:id="171" w:name="X18e52988b05aa71d4df245320bb8a9b8785eb33"/>
     <w:p>
       <w:pPr>
         <w:pStyle w:val="Heading2"/>
       </w:pPr>
       <w:r>
-        <w:t xml:space="preserve">Scene 10 — Sat 22:30 · Phòng tatami — futon</w:t>
+        <w:t xml:space="preserve">Tình huống 10 — Sat 22:30 · Phòng tatami — futon</w:t>
       </w:r>
     </w:p>
     <w:p>
@@ -54850,7 +54843,7 @@
                 <w:i/>
                 <w:iCs/>
               </w:rPr>
-              <w:t xml:space="preserve">(tiếng Việt) Đúng. Đó là lý do người Nhật business dùng onsen offsite. Không phải perk, là tool.</w:t>
+              <w:t xml:space="preserve">(tiếng Việt) Đúng. Đó là lý do người Nhật business dùng onsen offsite. Không phải phúc lợi thêm, mà là công cụ.</w:t>
             </w:r>
           </w:p>
         </w:tc>
@@ -55076,7 +55069,7 @@
         <w:t xml:space="preserve">(</w:t>
       </w:r>
       <w:r>
-        <w:t xml:space="preserve">‘onsen = tool not perk’</w:t>
+        <w:t xml:space="preserve">‘onsen = công cụ, không phải phúc lợi thêm’</w:t>
       </w:r>
       <w:r>
         <w:t xml:space="preserve">) — apply cho future.</w:t>
@@ -55097,13 +55090,13 @@
     </w:p>
     <w:bookmarkEnd w:id="170"/>
     <w:bookmarkEnd w:id="171"/>
-    <w:bookmarkStart w:id="173" w:name="scene-11-sun-1100-ga-atami-departure"/>
+    <w:bookmarkStart w:id="173" w:name="X6e9a8d4f76fc1a622c16c1a0d96454d4e6a564f"/>
     <w:p>
       <w:pPr>
         <w:pStyle w:val="Heading2"/>
       </w:pPr>
       <w:r>
-        <w:t xml:space="preserve">Scene 11 — Sun 11:00 · Ga Atami departure</w:t>
+        <w:t xml:space="preserve">Tình huống 11 — Sun 11:00 · Ga Atami departure</w:t>
       </w:r>
     </w:p>
     <w:p>
@@ -55855,7 +55848,7 @@
         <w:rPr>
           <w:rStyle w:val="VerbatimChar"/>
         </w:rPr>
-        <w:t xml:space="preserve">   → Khách JP business dùng onsen offsite có lý do, không phải perk.</w:t>
+        <w:t xml:space="preserve">   → Khách JP business dùng onsen offsite có lý do, không phải phúc lợi thêm.</w:t>
       </w:r>
       <w:r>
         <w:br/>
@@ -56074,7 +56067,7 @@
         <w:rPr>
           <w:rStyle w:val="VerbatimChar"/>
         </w:rPr>
-        <w:t xml:space="preserve">- Ōgaki conversation = career-defining advice ngoài career — về life.</w:t>
+        <w:t xml:space="preserve">- Ōgaki conversation = lời khuyên định hình sự nghiệp ngoài career — về cuộc đời.</w:t>
       </w:r>
       <w:r>
         <w:br/>
@@ -56328,13 +56321,13 @@
       </w:r>
     </w:p>
     <w:bookmarkEnd w:id="176"/>
-    <w:bookmarkStart w:id="178" w:name="X1f4c3ec7fcb8e080559ea3400342d01f73ece6e"/>
+    <w:bookmarkStart w:id="178" w:name="Xc919569efae162b8ffd288f282570e7c74658c8"/>
     <w:p>
       <w:pPr>
         <w:pStyle w:val="Heading2"/>
       </w:pPr>
       <w:r>
-        <w:t xml:space="preserve">Scene 1 — Day-1 18:00 · Hotel Pacifico Yokohama event hall — dry run rehearsal cuối</w:t>
+        <w:t xml:space="preserve">Tình huống 1 — Day-1 18:00 · Hotel Pacifico Yokohama event hall — dry run rehearsal cuối</w:t>
       </w:r>
     </w:p>
     <w:p>
@@ -57087,13 +57080,13 @@
     </w:p>
     <w:bookmarkEnd w:id="177"/>
     <w:bookmarkEnd w:id="178"/>
-    <w:bookmarkStart w:id="180" w:name="Xe2685c684146e8d50f5c95a3107b242b04a3ac3"/>
+    <w:bookmarkStart w:id="180" w:name="Xf474a04d6ea28588c66fe003781d716cdcce438"/>
     <w:p>
       <w:pPr>
         <w:pStyle w:val="Heading2"/>
       </w:pPr>
       <w:r>
-        <w:t xml:space="preserve">Scene 2 — Day-1 22:00 · Phòng khách sạn Dũng (Pacifico Hotel)</w:t>
+        <w:t xml:space="preserve">Tình huống 2 — Day-1 22:00 · Phòng khách sạn Dũng (Pacifico Hotel)</w:t>
       </w:r>
     </w:p>
     <w:p>
@@ -57264,13 +57257,13 @@
         <w:t xml:space="preserve">[Lên giường 22:45. Tắt đèn. Não vẫn chạy slide. Đếm thở 4-7-8 (kỹ thuật ngủ học từ Tuấn). 5 phút sau ngủ.]</w:t>
       </w:r>
     </w:p>
-    <w:bookmarkStart w:id="179" w:name="Xbab844570bd85870a755a0f3653d8eb264593e0"/>
+    <w:bookmarkStart w:id="179" w:name="Xd22730f86256d88225dbf6ab980bbfb4a65d524"/>
     <w:p>
       <w:pPr>
         <w:pStyle w:val="Heading3"/>
       </w:pPr>
       <w:r>
-        <w:t xml:space="preserve">💡 Bí quyết — Đêm trước stage — pre-flight checklist</w:t>
+        <w:t xml:space="preserve">💡 Bí quyết — Đêm trước stage — danh sách kiểm tra trước giờ G</w:t>
       </w:r>
     </w:p>
     <w:p>
@@ -57366,7 +57359,7 @@
         <w:t xml:space="preserve"> </w:t>
       </w:r>
       <w:r>
-        <w:t xml:space="preserve">(Tuấn HCMC) — close loop, anchor support.</w:t>
+        <w:t xml:space="preserve">(Tuấn HCMC) — close loop, điểm tựa tinh thần.</w:t>
       </w:r>
       <w:r>
         <w:t xml:space="preserve"> </w:t>
@@ -57444,13 +57437,13 @@
     </w:p>
     <w:bookmarkEnd w:id="179"/>
     <w:bookmarkEnd w:id="180"/>
-    <w:bookmarkStart w:id="182" w:name="Xc0ccdd3162ffd016eeb6432b58eb276ae2cc7ef"/>
+    <w:bookmarkStart w:id="182" w:name="X7431e9aa513c3f84ab64d499d2cb1f97f6d6036"/>
     <w:p>
       <w:pPr>
         <w:pStyle w:val="Heading2"/>
       </w:pPr>
       <w:r>
-        <w:t xml:space="preserve">Scene 3 — Day 0 07:30 · Lobby khách sạn — breakfast</w:t>
+        <w:t xml:space="preserve">Tình huống 3 — Day 0 07:30 · Lobby khách sạn — breakfast</w:t>
       </w:r>
     </w:p>
     <w:p>
@@ -58038,7 +58031,7 @@
         <w:t xml:space="preserve"> </w:t>
       </w:r>
       <w:r>
-        <w:t xml:space="preserve">= body language anchor.</w:t>
+        <w:t xml:space="preserve">= ngôn ngữ cơ thể tạo điểm chốt.</w:t>
       </w:r>
       <w:r>
         <w:t xml:space="preserve"> </w:t>
@@ -58068,13 +58061,13 @@
     </w:p>
     <w:bookmarkEnd w:id="181"/>
     <w:bookmarkEnd w:id="182"/>
-    <w:bookmarkStart w:id="184" w:name="scene-4-day-0-0830-backstage-event-hall"/>
+    <w:bookmarkStart w:id="184" w:name="X3d3c502352f87f8177dcb4f525728c221180f4a"/>
     <w:p>
       <w:pPr>
         <w:pStyle w:val="Heading2"/>
       </w:pPr>
       <w:r>
-        <w:t xml:space="preserve">Scene 4 — Day 0 08:30 · Backstage event hall</w:t>
+        <w:t xml:space="preserve">Tình huống 4 — Day 0 08:30 · Hậu trường event hall</w:t>
       </w:r>
     </w:p>
     <w:p>
@@ -58086,7 +58079,7 @@
           <w:i/>
           <w:iCs/>
         </w:rPr>
-        <w:t xml:space="preserve">Backstage chật, full crew technical + organizers + speakers waiting. Dũng đến check slot. Slide deck version mới chưa được upload lên screen. IT staff hỗ trợ 10 phút.</w:t>
+        <w:t xml:space="preserve">Hậu trường chật, full crew technical + organizers + speakers waiting. Dũng đến check slot. Slide deck version mới chưa được upload lên screen. IT staff hỗ trợ 10 phút.</w:t>
       </w:r>
     </w:p>
     <w:tbl>
@@ -58694,13 +58687,13 @@
     </w:p>
     <w:bookmarkEnd w:id="183"/>
     <w:bookmarkEnd w:id="184"/>
-    <w:bookmarkStart w:id="186" w:name="X23d7ce9e252e20308c4e1a4921590d48579661e"/>
+    <w:bookmarkStart w:id="186" w:name="X5567040737765d8f7b5a37567e0db1fc12ec26c"/>
     <w:p>
       <w:pPr>
         <w:pStyle w:val="Heading2"/>
       </w:pPr>
       <w:r>
-        <w:t xml:space="preserve">Scene 5 — Day 0 09:00 · Hành lang event hall — meet khách JP đến sớm</w:t>
+        <w:t xml:space="preserve">Tình huống 5 — Day 0 09:00 · Hành lang event hall — meet khách JP đến sớm</w:t>
       </w:r>
     </w:p>
     <w:p>
@@ -59230,7 +59223,7 @@
                 <w:i/>
                 <w:iCs/>
               </w:rPr>
-              <w:t xml:space="preserve">(mắt cảm kích) Cảm ơn Dũng, nice heads up.</w:t>
+              <w:t xml:space="preserve">(mắt cảm kích) Cảm ơn Dũng, báo trước hay đó.</w:t>
             </w:r>
           </w:p>
         </w:tc>
@@ -59374,7 +59367,7 @@
           <w:b/>
           <w:bCs/>
         </w:rPr>
-        <w:t xml:space="preserve">Heads up senior</w:t>
+        <w:t xml:space="preserve">Báo trước senior</w:t>
       </w:r>
       <w:r>
         <w:t xml:space="preserve"> </w:t>
@@ -59457,13 +59450,13 @@
     </w:p>
     <w:bookmarkEnd w:id="185"/>
     <w:bookmarkEnd w:id="186"/>
-    <w:bookmarkStart w:id="188" w:name="Xa7c9b6c57e00d6bf0c0c9af4686ab16edf2746f"/>
+    <w:bookmarkStart w:id="188" w:name="X369283ff9c782427c1062cf2557384f11261ced"/>
     <w:p>
       <w:pPr>
         <w:pStyle w:val="Heading2"/>
       </w:pPr>
       <w:r>
-        <w:t xml:space="preserve">Scene 6 — Day 0 10:00 · Stage — opening ceremony</w:t>
+        <w:t xml:space="preserve">Tình huống 6 — Day 0 10:00 · Stage — opening ceremony</w:t>
       </w:r>
     </w:p>
     <w:p>
@@ -59977,13 +59970,13 @@
     </w:p>
     <w:bookmarkEnd w:id="187"/>
     <w:bookmarkEnd w:id="188"/>
-    <w:bookmarkStart w:id="190" w:name="Xab58f8a8a05a84d1ce7ff213d7d0f9ff15dbc30"/>
+    <w:bookmarkStart w:id="190" w:name="X1e43fa11b10d2cecfc46310a2cb9b83c2f2b73c"/>
     <w:p>
       <w:pPr>
         <w:pStyle w:val="Heading2"/>
       </w:pPr>
       <w:r>
-        <w:t xml:space="preserve">Scene 7 — Day 0 10:30 · Stage — Dũng intro 5 phút</w:t>
+        <w:t xml:space="preserve">Tình huống 7 — Day 0 10:30 · Stage — Dũng intro 5 phút</w:t>
       </w:r>
     </w:p>
     <w:p>
@@ -60933,13 +60926,13 @@
     </w:p>
     <w:bookmarkEnd w:id="189"/>
     <w:bookmarkEnd w:id="190"/>
-    <w:bookmarkStart w:id="192" w:name="Xde1b0db7ff42d282d085453a0907d311cd00ad1"/>
+    <w:bookmarkStart w:id="192" w:name="Xa8af0703812771a825a1634a8c403b3114c04de"/>
     <w:p>
       <w:pPr>
         <w:pStyle w:val="Heading2"/>
       </w:pPr>
       <w:r>
-        <w:t xml:space="preserve">Scene 8 — Day 0 11:30 · Stage — Q&amp;A panel session</w:t>
+        <w:t xml:space="preserve">Tình huống 8 — Day 0 11:30 · Stage — Q&amp;A panel session</w:t>
       </w:r>
     </w:p>
     <w:p>
@@ -61757,13 +61750,13 @@
     </w:p>
     <w:bookmarkEnd w:id="191"/>
     <w:bookmarkEnd w:id="192"/>
-    <w:bookmarkStart w:id="194" w:name="X4a3f24704517c9a6218ec6ca0082e8d9d82fa60"/>
+    <w:bookmarkStart w:id="194" w:name="X7366876ccbabdaa48e57f9efc0699d36cfb4158"/>
     <w:p>
       <w:pPr>
         <w:pStyle w:val="Heading2"/>
       </w:pPr>
       <w:r>
-        <w:t xml:space="preserve">Scene 9 — Day 0 12:30 · Networking lunch buffet</w:t>
+        <w:t xml:space="preserve">Tình huống 9 — Day 0 12:30 · Networking lunch buffet</w:t>
       </w:r>
     </w:p>
     <w:p>
@@ -62520,13 +62513,13 @@
     </w:p>
     <w:bookmarkEnd w:id="193"/>
     <w:bookmarkEnd w:id="194"/>
-    <w:bookmarkStart w:id="196" w:name="X16f09afa95464949309d0185517011028469f1d"/>
+    <w:bookmarkStart w:id="196" w:name="X6e8125947f0f41e117916fa2c539ceede6f4a86"/>
     <w:p>
       <w:pPr>
         <w:pStyle w:val="Heading2"/>
       </w:pPr>
       <w:r>
-        <w:t xml:space="preserve">Scene 10 — Day 0 15:00 · Booth demo — Dũng phụ Inoue</w:t>
+        <w:t xml:space="preserve">Tình huống 10 — Day 0 15:00 · Booth demo — Dũng phụ Inoue</w:t>
       </w:r>
     </w:p>
     <w:p>
@@ -63281,13 +63274,13 @@
     </w:p>
     <w:bookmarkEnd w:id="195"/>
     <w:bookmarkEnd w:id="196"/>
-    <w:bookmarkStart w:id="198" w:name="X4c92c543dc70d71e2a8a52b53605ad8f9aa242d"/>
+    <w:bookmarkStart w:id="198" w:name="Xff21cddbb5a67947387f229271ba2e79c14100a"/>
     <w:p>
       <w:pPr>
         <w:pStyle w:val="Heading2"/>
       </w:pPr>
       <w:r>
-        <w:t xml:space="preserve">Scene 11 — Day 0 18:00 · Reception party event</w:t>
+        <w:t xml:space="preserve">Tình huống 11 — Day 0 18:00 · Reception party event</w:t>
       </w:r>
     </w:p>
     <w:p>
@@ -63971,13 +63964,13 @@
     </w:p>
     <w:bookmarkEnd w:id="197"/>
     <w:bookmarkEnd w:id="198"/>
-    <w:bookmarkStart w:id="200" w:name="Xf9032e028d6a0715a94f5eb68b0544aedcfa97e"/>
+    <w:bookmarkStart w:id="200" w:name="X29dc3ac9fac8af33bc384ac740ed785d0db2e8f"/>
     <w:p>
       <w:pPr>
         <w:pStyle w:val="Heading2"/>
       </w:pPr>
       <w:r>
-        <w:t xml:space="preserve">Scene 12 — Day 0 22:00 · Phòng khách sạn Dũng (Pacifico)</w:t>
+        <w:t xml:space="preserve">Tình huống 12 — Day 0 22:00 · Phòng khách sạn Dũng (Pacifico)</w:t>
       </w:r>
     </w:p>
     <w:p>
@@ -64426,7 +64419,7 @@
         <w:t xml:space="preserve"> </w:t>
       </w:r>
       <w:r>
-        <w:t xml:space="preserve">— gọi mẹ 5 phút, anchor identity ngoài career.</w:t>
+        <w:t xml:space="preserve">— gọi mẹ 5 phút, giữ vững bản thân ngoài career.</w:t>
       </w:r>
       <w:r>
         <w:t xml:space="preserve"> </w:t>
@@ -64442,7 +64435,7 @@
           <w:b/>
           <w:bCs/>
         </w:rPr>
-        <w:t xml:space="preserve">Tomorrow follow-up list</w:t>
+        <w:t xml:space="preserve">Lập danh sách tiếp nối ngày mai</w:t>
       </w:r>
       <w:r>
         <w:t xml:space="preserve"> </w:t>
@@ -64683,7 +64676,7 @@
         <w:rPr>
           <w:rStyle w:val="VerbatimChar"/>
         </w:rPr>
-        <w:t xml:space="preserve">- [ ] This week: follow-up mail 20 leads (8 lunch + 12 reception)</w:t>
+        <w:t xml:space="preserve">- [ ] This week: gửi mail tiếp nối 20 leads (8 lunch + 12 reception)</w:t>
       </w:r>
       <w:r>
         <w:br/>
@@ -65063,13 +65056,13 @@
       </w:r>
     </w:p>
     <w:bookmarkEnd w:id="203"/>
-    <w:bookmarkStart w:id="205" w:name="X9d898ec718acf5d365fb21067fcbe87a688933e"/>
+    <w:bookmarkStart w:id="205" w:name="X6e9843ac2e98d865c8d3f26bff18a303203d858"/>
     <w:p>
       <w:pPr>
         <w:pStyle w:val="Heading2"/>
       </w:pPr>
       <w:r>
-        <w:t xml:space="preserve">Scene 1 — Tue tuần trước 09:00 · Office Thiên Phát quận 7</w:t>
+        <w:t xml:space="preserve">Tình huống 1 — Tue tuần trước 09:00 · Office Thiên Phát quận 7</w:t>
       </w:r>
     </w:p>
     <w:p>
@@ -65885,13 +65878,13 @@
     </w:p>
     <w:bookmarkEnd w:id="204"/>
     <w:bookmarkEnd w:id="205"/>
-    <w:bookmarkStart w:id="207" w:name="X6e8c76554ff8ee12b6fecc7650413685933f49e"/>
+    <w:bookmarkStart w:id="207" w:name="Xc88f33d37af60f9697396c64656220e7bb8c4a5"/>
     <w:p>
       <w:pPr>
         <w:pStyle w:val="Heading2"/>
       </w:pPr>
       <w:r>
-        <w:t xml:space="preserve">Scene 2 — Sat 11:30 · Lobby chapel khách sạn Imperial Tokyo</w:t>
+        <w:t xml:space="preserve">Tình huống 2 — Sat 11:30 · Lobby chapel khách sạn Imperial Tokyo</w:t>
       </w:r>
     </w:p>
     <w:p>
@@ -66785,13 +66778,13 @@
     </w:p>
     <w:bookmarkEnd w:id="206"/>
     <w:bookmarkEnd w:id="207"/>
-    <w:bookmarkStart w:id="209" w:name="X02bd8a7e529af29fbeeea089494fdc133b6b1b6"/>
+    <w:bookmarkStart w:id="209" w:name="Xe4237c5af207714323a7473b54f57123239d57f"/>
     <w:p>
       <w:pPr>
         <w:pStyle w:val="Heading2"/>
       </w:pPr>
       <w:r>
-        <w:t xml:space="preserve">Scene 3 — Sat 12:00 · Chapel — wedding ceremony Christian style</w:t>
+        <w:t xml:space="preserve">Tình huống 3 — Sat 12:00 · Chapel — wedding ceremony Christian style</w:t>
       </w:r>
     </w:p>
     <w:p>
@@ -67215,13 +67208,13 @@
     </w:p>
     <w:bookmarkEnd w:id="208"/>
     <w:bookmarkEnd w:id="209"/>
-    <w:bookmarkStart w:id="211" w:name="X3447b8a8d4edebfe092e2c43b79a32f111c6058"/>
+    <w:bookmarkStart w:id="211" w:name="X91ace59d1fb9741ed765d4b6eccab6d4e8071cb"/>
     <w:p>
       <w:pPr>
         <w:pStyle w:val="Heading2"/>
       </w:pPr>
       <w:r>
-        <w:t xml:space="preserve">Scene 4 — Sat 13:00 · Reception hall — bắt đầu speech</w:t>
+        <w:t xml:space="preserve">Tình huống 4 — Sat 13:00 · Reception hall — bắt đầu speech</w:t>
       </w:r>
     </w:p>
     <w:p>
@@ -67991,7 +67984,7 @@
         <w:t xml:space="preserve"> </w:t>
       </w:r>
       <w:r>
-        <w:t xml:space="preserve">- Speech bố Tanaka về Tanaka khi nhỏ = window vào con người mới của Tanaka — bonus context cho Dũng.</w:t>
+        <w:t xml:space="preserve">- Speech bố Tanaka về Tanaka khi nhỏ = cánh cửa vào con người thật của Tanaka — bonus context cho Dũng.</w:t>
       </w:r>
     </w:p>
     <w:p>
@@ -68003,13 +67996,13 @@
     </w:p>
     <w:bookmarkEnd w:id="210"/>
     <w:bookmarkEnd w:id="211"/>
-    <w:bookmarkStart w:id="213" w:name="scene-5-sat-1400-bàn-round-8-người"/>
+    <w:bookmarkStart w:id="213" w:name="tình-huống-5-sat-1400-bàn-round-8-người"/>
     <w:p>
       <w:pPr>
         <w:pStyle w:val="Heading2"/>
       </w:pPr>
       <w:r>
-        <w:t xml:space="preserve">Scene 5 — Sat 14:00 · Bàn round 8 người</w:t>
+        <w:t xml:space="preserve">Tình huống 5 — Sat 14:00 · Bàn round 8 người</w:t>
       </w:r>
     </w:p>
     <w:p>
@@ -68861,13 +68854,13 @@
     </w:p>
     <w:bookmarkEnd w:id="212"/>
     <w:bookmarkEnd w:id="213"/>
-    <w:bookmarkStart w:id="215" w:name="scene-6-sat-1500-bàn-round"/>
+    <w:bookmarkStart w:id="215" w:name="tình-huống-6-sat-1500-bàn-round"/>
     <w:p>
       <w:pPr>
         <w:pStyle w:val="Heading2"/>
       </w:pPr>
       <w:r>
-        <w:t xml:space="preserve">Scene 6 — Sat 15:00 · Bàn round</w:t>
+        <w:t xml:space="preserve">Tình huống 6 — Sat 15:00 · Bàn round</w:t>
       </w:r>
     </w:p>
     <w:p>
@@ -69774,13 +69767,13 @@
     </w:p>
     <w:bookmarkEnd w:id="214"/>
     <w:bookmarkEnd w:id="215"/>
-    <w:bookmarkStart w:id="217" w:name="scene-7-sat-1530-bàn-round"/>
+    <w:bookmarkStart w:id="217" w:name="tình-huống-7-sat-1530-bàn-round"/>
     <w:p>
       <w:pPr>
         <w:pStyle w:val="Heading2"/>
       </w:pPr>
       <w:r>
-        <w:t xml:space="preserve">Scene 7 — Sat 15:30 · Bàn round</w:t>
+        <w:t xml:space="preserve">Tình huống 7 — Sat 15:30 · Bàn round</w:t>
       </w:r>
     </w:p>
     <w:p>
@@ -70489,13 +70482,13 @@
     </w:p>
     <w:bookmarkEnd w:id="216"/>
     <w:bookmarkEnd w:id="217"/>
-    <w:bookmarkStart w:id="219" w:name="X19e81bf181c08d5ae9b545fcffe7eef702c98c3"/>
+    <w:bookmarkStart w:id="219" w:name="X8fbb8e1650c3436634db1a1ec37bc3df32adeed"/>
     <w:p>
       <w:pPr>
         <w:pStyle w:val="Heading2"/>
       </w:pPr>
       <w:r>
-        <w:t xml:space="preserve">Scene 8 — Sat 16:00 · Hành lang reception — break 15 phút</w:t>
+        <w:t xml:space="preserve">Tình huống 8 — Sat 16:00 · Hành lang reception — break 15 phút</w:t>
       </w:r>
     </w:p>
     <w:p>
@@ -71209,13 +71202,13 @@
     </w:p>
     <w:bookmarkEnd w:id="218"/>
     <w:bookmarkEnd w:id="219"/>
-    <w:bookmarkStart w:id="221" w:name="Xb8513fbd74dc0ec0cf6343f223971fe49eae113"/>
+    <w:bookmarkStart w:id="221" w:name="X2446dc200815eed12fa0997941cd58c01ed2bec"/>
     <w:p>
       <w:pPr>
         <w:pStyle w:val="Heading2"/>
       </w:pPr>
       <w:r>
-        <w:t xml:space="preserve">Scene 9 — Sat 17:00 · Reception cuối — bouquet toss</w:t>
+        <w:t xml:space="preserve">Tình huống 9 — Sat 17:00 · Reception cuối — bouquet toss</w:t>
       </w:r>
     </w:p>
     <w:p>
@@ -71704,13 +71697,13 @@
     </w:p>
     <w:bookmarkEnd w:id="220"/>
     <w:bookmarkEnd w:id="221"/>
-    <w:bookmarkStart w:id="223" w:name="Xcda3a8f9e73b5e683aeb9c9128370bd6e3cfe00"/>
+    <w:bookmarkStart w:id="223" w:name="X714fab8a08c32d4a2c0729973e10b0b0a9bf447"/>
     <w:p>
       <w:pPr>
         <w:pStyle w:val="Heading2"/>
       </w:pPr>
       <w:r>
-        <w:t xml:space="preserve">Scene 10 — Sat 17:30 · Cửa reception — chia tay Tanaka + Yumi</w:t>
+        <w:t xml:space="preserve">Tình huống 10 — Sat 17:30 · Cửa reception — chia tay Tanaka + Yumi</w:t>
       </w:r>
     </w:p>
     <w:p>
@@ -72376,13 +72369,13 @@
     </w:p>
     <w:bookmarkEnd w:id="222"/>
     <w:bookmarkEnd w:id="223"/>
-    <w:bookmarkStart w:id="225" w:name="X0fc6d75cb8b3f87da8f3ef2b287fadbfaf81c80"/>
+    <w:bookmarkStart w:id="225" w:name="X3b36c5beefb3f52f48de4e2cf86206018932983"/>
     <w:p>
       <w:pPr>
         <w:pStyle w:val="Heading2"/>
       </w:pPr>
       <w:r>
-        <w:t xml:space="preserve">Scene 11 — Sat 19:00 · Pub Ginza — niji-kai sau wedding</w:t>
+        <w:t xml:space="preserve">Tình huống 11 — Sat 19:00 · Pub Ginza — niji-kai sau wedding</w:t>
       </w:r>
     </w:p>
     <w:p>
@@ -72594,7 +72587,7 @@
                 <w:i/>
                 <w:iCs/>
               </w:rPr>
-              <w:t xml:space="preserve">(thật) … honest, văn hóa shock. Theo nghĩa tốt. Cách thể hiện gia đình của Nhật, layer ấm áp, khác cả cách Việt Nam của em lẫn sách giáo khoa em đọc.</w:t>
+              <w:t xml:space="preserve">(thật) … honest, sốc văn hóa. Theo nghĩa tốt. Cách thể hiện gia đình của Nhật, layer ấm áp, khác cả cách Việt Nam của em lẫn sách giáo khoa em đọc.</w:t>
             </w:r>
           </w:p>
         </w:tc>
@@ -73350,13 +73343,13 @@
         <w:pStyle w:val="FirstParagraph"/>
       </w:pPr>
       <w:r>
-        <w:t xml:space="preserve">Niji-kai sau wedding = relationship đã sang level</w:t>
-      </w:r>
-      <w:r>
-        <w:t xml:space="preserve"> </w:t>
-      </w:r>
-      <w:r>
-        <w:t xml:space="preserve">‘family-acquaintance’</w:t>
+        <w:t xml:space="preserve">Niji-kai sau wedding = relationship đã sang tầng</w:t>
+      </w:r>
+      <w:r>
+        <w:t xml:space="preserve"> </w:t>
+      </w:r>
+      <w:r>
+        <w:t xml:space="preserve">‘quen biết như gia đình’</w:t>
       </w:r>
       <w:r>
         <w:t xml:space="preserve">:</w:t>
@@ -73434,7 +73427,7 @@
         <w:t xml:space="preserve"> </w:t>
       </w:r>
       <w:r>
-        <w:t xml:space="preserve">— câu chuyện đám cưới bố mẹ thập niên 80 = window vào lịch sử personal, deepen relationship.</w:t>
+        <w:t xml:space="preserve">— câu chuyện đám cưới bố mẹ thập niên 80 = cánh cửa vào lịch sử cá nhân, deepen relationship.</w:t>
       </w:r>
       <w:r>
         <w:t xml:space="preserve"> </w:t>
@@ -73456,7 +73449,7 @@
         <w:t xml:space="preserve"> </w:t>
       </w:r>
       <w:r>
-        <w:t xml:space="preserve">= relationship cuối chương sang level</w:t>
+        <w:t xml:space="preserve">= relationship cuối chương sang tầng</w:t>
       </w:r>
       <w:r>
         <w:t xml:space="preserve"> </w:t>
@@ -73465,7 +73458,7 @@
         <w:t xml:space="preserve">‘sẽ vào nhà nhau’</w:t>
       </w:r>
       <w:r>
-        <w:t xml:space="preserve">. Career-defining moment.</w:t>
+        <w:t xml:space="preserve">. Khoảnh khắc định hình sự nghiệp.</w:t>
       </w:r>
       <w:r>
         <w:t xml:space="preserve"> </w:t>
@@ -73591,7 +73584,7 @@
         <w:rPr>
           <w:rStyle w:val="VerbatimChar"/>
         </w:rPr>
-        <w:t xml:space="preserve">   hiểu tiếng Nhật hết. Wedding window vào history family Nhật.</w:t>
+        <w:t xml:space="preserve">   hiểu tiếng Nhật hết. Đám cưới — cánh cửa vào lịch sử gia đình Nhật.</w:t>
       </w:r>
       <w:r>
         <w:br/>
@@ -73618,7 +73611,7 @@
         <w:rPr>
           <w:rStyle w:val="VerbatimChar"/>
         </w:rPr>
-        <w:t xml:space="preserve">   → Relationship sang chiều 'family-to-family'. Career-defining.</w:t>
+        <w:t xml:space="preserve">   → Relationship sang chiều 'gia đình qua lại'. Dấu mốc định hình sự nghiệp.</w:t>
       </w:r>
       <w:r>
         <w:br/>

</xml_diff>